<commit_message>
Update resume: cPanel end date, ABS (Xtera & Cohu), Wolters Kluwer
</commit_message>
<xml_diff>
--- a/web/Resumes/Andrew/Resume.docx
+++ b/web/Resumes/Andrew/Resume.docx
@@ -372,6 +372,134 @@
       </w:r>
     </w:p>
     <w:p>
+      <w:pPr/>
+      <w:r>
+        <w:rPr>
+          <w:b/>
+        </w:rPr>
+        <w:t>SCM / Systems Engineering Consultant | ABS Consulting (Client: Cohu) | CA</w:t>
+        <w:br/>
+      </w:r>
+      <w:r>
+        <w:rPr>
+          <w:b w:val="0"/>
+        </w:rPr>
+        <w:t>June 2026 - Present</w:t>
+      </w:r>
+    </w:p>
+    <w:p>
+      <w:pPr>
+        <w:pStyle w:val="ListBullet"/>
+      </w:pPr>
+      <w:r>
+        <w:t>Architecting and executing migration of enterprise IBM Rational ClearCase VOBs and multi-branch repositories to modern Git (cohu1 / cohu2 migration infrastructure).</w:t>
+      </w:r>
+    </w:p>
+    <w:p>
+      <w:pPr>
+        <w:pStyle w:val="ListBullet"/>
+      </w:pPr>
+      <w:r>
+        <w:t>Designing automated branching strategies, historical metadata preservation, merge conflict workflows, and CI/CD pipeline integration.</w:t>
+      </w:r>
+    </w:p>
+    <w:p>
+      <w:pPr>
+        <w:pStyle w:val="ListBullet"/>
+      </w:pPr>
+      <w:r>
+        <w:t>Administering Linux migration hosts, build automation environments, and developer tooling.</w:t>
+      </w:r>
+    </w:p>
+    <w:p>
+      <w:pPr/>
+      <w:r>
+        <w:rPr>
+          <w:b/>
+        </w:rPr>
+        <w:t>Senior Perl / Software Systems Engineer (Contract) | Wolters Kluwer | Remote</w:t>
+        <w:br/>
+      </w:r>
+      <w:r>
+        <w:rPr>
+          <w:b w:val="0"/>
+        </w:rPr>
+        <w:t>March 2026 - August 2026</w:t>
+      </w:r>
+    </w:p>
+    <w:p>
+      <w:pPr>
+        <w:pStyle w:val="ListBullet"/>
+      </w:pPr>
+      <w:r>
+        <w:t>Maintained, modernized, and optimized core enterprise backend applications running on Amazon Linux, Apache, and mod_perl.</w:t>
+      </w:r>
+    </w:p>
+    <w:p>
+      <w:pPr>
+        <w:pStyle w:val="ListBullet"/>
+      </w:pPr>
+      <w:r>
+        <w:t>Diagnosed and resolved critical production memory exhaustion and child-process management/reaping issues across high-volume Linux service infrastructure.</w:t>
+      </w:r>
+    </w:p>
+    <w:p>
+      <w:pPr>
+        <w:pStyle w:val="ListBullet"/>
+      </w:pPr>
+      <w:r>
+        <w:t>Evaluated modern migration paths from legacy Amazon Linux 2 / Apache 2.2 / OpenSSL to Amazon Linux 2023, Nginx, and containerized Docker development environments.</w:t>
+      </w:r>
+    </w:p>
+    <w:p>
+      <w:pPr>
+        <w:pStyle w:val="ListBullet"/>
+      </w:pPr>
+      <w:r>
+        <w:t>Engineered Jenkins CI/CD automation pipelines, telemetry integration (OpenTelemetry, New Relic), and security vulnerability scanning (Black Duck).</w:t>
+      </w:r>
+    </w:p>
+    <w:p>
+      <w:pPr>
+        <w:pStyle w:val="ListBullet"/>
+      </w:pPr>
+      <w:r>
+        <w:t>Integrated full-stack REST services, Redis caching layers, NFS network storage, and dynamic frontend web components.</w:t>
+      </w:r>
+    </w:p>
+    <w:p>
+      <w:pPr/>
+      <w:r>
+        <w:rPr>
+          <w:b/>
+        </w:rPr>
+        <w:t>SCM / Systems Consultant | ABS Consulting (Client: Xtera) | CA</w:t>
+        <w:br/>
+      </w:r>
+      <w:r>
+        <w:rPr>
+          <w:b w:val="0"/>
+        </w:rPr>
+        <w:t>April 2025 - November 2025</w:t>
+      </w:r>
+    </w:p>
+    <w:p>
+      <w:pPr>
+        <w:pStyle w:val="ListBullet"/>
+      </w:pPr>
+      <w:r>
+        <w:t>Delivered SCM architecture, build &amp; release engineering, and Linux infrastructure automation for optical networking systems.</w:t>
+      </w:r>
+    </w:p>
+    <w:p>
+      <w:pPr>
+        <w:pStyle w:val="ListBullet"/>
+      </w:pPr>
+      <w:r>
+        <w:t>Streamlined version control workflows (Git / ClearCase), continuous integration, and automated packaging/deployment scripts.</w:t>
+      </w:r>
+    </w:p>
+    <w:p>
       <w:r>
         <w:rPr>
           <w:b/>
@@ -383,7 +511,7 @@
         <w:rPr>
           <w:i/>
         </w:rPr>
-        <w:t>October 2021 - Current</w:t>
+        <w:t>October 2021 - May 2024</w:t>
       </w:r>
     </w:p>
     <w:p>

</xml_diff>

<commit_message>
feat: add Python script to generate Word document resume from HTML index page
</commit_message>
<xml_diff>
--- a/web/Resumes/Andrew/Resume.docx
+++ b/web/Resumes/Andrew/Resume.docx
@@ -3,8 +3,12 @@
 <w:document xmlns:wpc="http://schemas.microsoft.com/office/word/2010/wordprocessingCanvas" xmlns:mo="http://schemas.microsoft.com/office/mac/office/2008/main" xmlns:mc="http://schemas.openxmlformats.org/markup-compatibility/2006" xmlns:mv="urn:schemas-microsoft-com:mac:vml" xmlns:o="urn:schemas-microsoft-com:office:office" xmlns:r="http://schemas.openxmlformats.org/officeDocument/2006/relationships" xmlns:m="http://schemas.openxmlformats.org/officeDocument/2006/math" xmlns:v="urn:schemas-microsoft-com:vml" xmlns:wp14="http://schemas.microsoft.com/office/word/2010/wordprocessingDrawing" xmlns:wp="http://schemas.openxmlformats.org/drawingml/2006/wordprocessingDrawing" xmlns:w10="urn:schemas-microsoft-com:office:word" xmlns:w="http://schemas.openxmlformats.org/wordprocessingml/2006/main" xmlns:w14="http://schemas.microsoft.com/office/word/2010/wordml" xmlns:wpg="http://schemas.microsoft.com/office/word/2010/wordprocessingGroup" xmlns:wpi="http://schemas.microsoft.com/office/word/2010/wordprocessingInk" xmlns:wne="http://schemas.microsoft.com/office/word/2006/wordml" xmlns:wps="http://schemas.microsoft.com/office/word/2010/wordprocessingShape" mc:Ignorable="w14 wp14">
   <w:body>
     <w:p>
+      <w:pPr>
+        <w:spacing w:before="0" w:after="0"/>
+      </w:pPr>
       <w:r>
         <w:rPr>
+          <w:rFonts w:ascii="Arial" w:hAnsi="Arial"/>
           <w:color w:val="FFFFFF"/>
           <w:sz w:val="2"/>
         </w:rPr>
@@ -13,130 +17,232 @@
     </w:p>
     <w:p>
       <w:pPr>
-        <w:pStyle w:val="Title"/>
+        <w:spacing w:before="0" w:after="40"/>
+        <w:jc w:val="center"/>
       </w:pPr>
       <w:r>
+        <w:rPr>
+          <w:rFonts w:ascii="Dancing Script" w:hAnsi="Dancing Script" w:cs="Brush Script MT"/>
+          <w:color w:val="3B82F6"/>
+          <w:sz w:val="60"/>
+        </w:rPr>
         <w:t>Andrew DeFaria</w:t>
       </w:r>
     </w:p>
     <w:p>
+      <w:pPr>
+        <w:spacing w:before="0" w:after="160"/>
+        <w:jc w:val="center"/>
+      </w:pPr>
+      <w:hyperlink r:id="rId9">
+        <w:r>
+          <w:rPr>
+            <w:rFonts w:ascii="Arial" w:hAnsi="Arial"/>
+            <w:color w:val="2563EB"/>
+            <w:sz w:val="19"/>
+            <w:u w:val="single"/>
+          </w:rPr>
+          <w:t xml:space="preserve">(408) 596-4937</w:t>
+        </w:r>
+      </w:hyperlink>
       <w:r>
-        <w:t>(408) 596-4937 • Andrew@DeFaria.com</w:t>
+        <w:rPr>
+          <w:rFonts w:ascii="Arial" w:hAnsi="Arial"/>
+          <w:color w:val="6B7280"/>
+          <w:sz w:val="19"/>
+        </w:rPr>
+        <w:t xml:space="preserve">   •   </w:t>
+      </w:r>
+      <w:hyperlink r:id="rId10">
+        <w:r>
+          <w:rPr>
+            <w:rFonts w:ascii="Arial" w:hAnsi="Arial"/>
+            <w:color w:val="2563EB"/>
+            <w:sz w:val="19"/>
+            <w:u w:val="single"/>
+          </w:rPr>
+          <w:t xml:space="preserve">Andrew@DeFaria.com</w:t>
+        </w:r>
+      </w:hyperlink>
+    </w:p>
+    <w:p>
+      <w:pPr>
+        <w:keepNext/>
+        <w:spacing w:before="200" w:after="80"/>
+      </w:pPr>
+      <w:r>
+        <w:rPr>
+          <w:rFonts w:ascii="Arial" w:hAnsi="Arial"/>
+          <w:b/>
+          <w:color w:val="3B82F6"/>
+          <w:sz w:val="23"/>
+        </w:rPr>
+        <w:t>PROFESSIONAL SUMMARY</w:t>
       </w:r>
     </w:p>
     <w:p>
       <w:pPr>
-        <w:pStyle w:val="Heading1"/>
+        <w:spacing w:before="0" w:after="80" w:line="276" w:lineRule="auto"/>
+        <w:ind w:left="0" w:firstLine="0"/>
       </w:pPr>
       <w:r>
-        <w:t>Professional Summary</w:t>
-      </w:r>
-    </w:p>
-    <w:p>
-      <w:r>
+        <w:rPr>
+          <w:rFonts w:ascii="Arial" w:hAnsi="Arial"/>
+          <w:color w:val="1F2937"/>
+          <w:sz w:val="19"/>
+        </w:rPr>
         <w:t>Seeking a position in IT operations and network management to leverage over 20 years of expertise in state-of-the-art operating systems and networks, ensuring seamless information flow and system performance. Open to remote work or hybrid roles in the San Diego area.</w:t>
       </w:r>
     </w:p>
     <w:p>
       <w:pPr>
-        <w:pStyle w:val="Heading1"/>
+        <w:keepNext/>
+        <w:spacing w:before="200" w:after="80"/>
       </w:pPr>
       <w:r>
-        <w:t>Skills</w:t>
+        <w:rPr>
+          <w:rFonts w:ascii="Arial" w:hAnsi="Arial"/>
+          <w:b/>
+          <w:color w:val="3B82F6"/>
+          <w:sz w:val="23"/>
+        </w:rPr>
+        <w:t>SKILLS</w:t>
       </w:r>
     </w:p>
     <w:tbl>
       <w:tblPr>
         <w:tblW w:type="auto" w:w="0"/>
+        <w:jc w:val="center"/>
+        <w:tblLayout w:type="fixed"/>
         <w:tblLook w:firstColumn="1" w:firstRow="1" w:lastColumn="0" w:lastRow="0" w:noHBand="0" w:noVBand="1" w:val="04A0"/>
+        <w:tblBorders>
+          <w:top w:val="none"/>
+          <w:left w:val="none"/>
+          <w:bottom w:val="none"/>
+          <w:right w:val="none"/>
+          <w:insideH w:val="none"/>
+          <w:insideV w:val="none"/>
+        </w:tblBorders>
       </w:tblPr>
       <w:tblGrid>
-        <w:gridCol w:w="4320"/>
-        <w:gridCol w:w="4320"/>
+        <w:gridCol w:w="3456"/>
+        <w:gridCol w:w="3456"/>
+        <w:gridCol w:w="3456"/>
       </w:tblGrid>
       <w:tr>
         <w:tc>
           <w:tcPr>
-            <w:tcW w:type="dxa" w:w="4320"/>
+            <w:tcW w:type="dxa" w:w="3427"/>
+            <w:vAlign w:val="top"/>
+            <w:tcMar>
+              <w:top w:w="40" w:type="dxa"/>
+              <w:bottom w:w="90" w:type="dxa"/>
+              <w:left w:w="30" w:type="dxa"/>
+              <w:right w:w="80" w:type="dxa"/>
+            </w:tcMar>
           </w:tcPr>
           <w:p>
+            <w:pPr>
+              <w:spacing w:before="0" w:after="40" w:line="276" w:lineRule="auto"/>
+            </w:pPr>
             <w:r>
-              <w:t>Category</w:t>
+              <w:rPr>
+                <w:rFonts w:ascii="Arial" w:hAnsi="Arial"/>
+                <w:b/>
+                <w:color w:val="16A34A"/>
+                <w:sz w:val="19"/>
+              </w:rPr>
+              <w:t>Hardware</w:t>
+            </w:r>
+          </w:p>
+          <w:p>
+            <w:pPr>
+              <w:spacing w:before="0" w:after="80" w:line="276" w:lineRule="auto"/>
+            </w:pPr>
+            <w:r>
+              <w:rPr>
+                <w:rFonts w:ascii="Arial" w:hAnsi="Arial"/>
+                <w:color w:val="1F2937"/>
+                <w:sz w:val="17"/>
+              </w:rPr>
+              <w:t>Workstations and servers from Sun, HP, Microsoft Windows, various manufacturers of Linux systems</w:t>
             </w:r>
           </w:p>
         </w:tc>
         <w:tc>
           <w:tcPr>
-            <w:tcW w:type="dxa" w:w="4320"/>
+            <w:tcW w:type="dxa" w:w="3427"/>
+            <w:vAlign w:val="top"/>
+            <w:tcMar>
+              <w:top w:w="40" w:type="dxa"/>
+              <w:bottom w:w="90" w:type="dxa"/>
+              <w:left w:w="30" w:type="dxa"/>
+              <w:right w:w="80" w:type="dxa"/>
+            </w:tcMar>
           </w:tcPr>
           <w:p>
+            <w:pPr>
+              <w:spacing w:before="0" w:after="40" w:line="276" w:lineRule="auto"/>
+            </w:pPr>
             <w:r>
-              <w:t>Technologies</w:t>
+              <w:rPr>
+                <w:rFonts w:ascii="Arial" w:hAnsi="Arial"/>
+                <w:b/>
+                <w:color w:val="16A34A"/>
+                <w:sz w:val="19"/>
+              </w:rPr>
+              <w:t>Operating Systems</w:t>
             </w:r>
           </w:p>
-        </w:tc>
-      </w:tr>
-      <w:tr>
-        <w:tc>
-          <w:tcPr>
-            <w:tcW w:type="dxa" w:w="4320"/>
-          </w:tcPr>
           <w:p>
+            <w:pPr>
+              <w:spacing w:before="0" w:after="80" w:line="276" w:lineRule="auto"/>
+            </w:pPr>
             <w:r>
-              <w:t>Hardware</w:t>
+              <w:rPr>
+                <w:rFonts w:ascii="Arial" w:hAnsi="Arial"/>
+                <w:color w:val="1F2937"/>
+                <w:sz w:val="17"/>
+              </w:rPr>
+              <w:t>Linux (Redhat, Centos, Ubuntu), Windows, Unix (Solaris, HP-UX), Cygwin</w:t>
             </w:r>
           </w:p>
         </w:tc>
         <w:tc>
           <w:tcPr>
-            <w:tcW w:type="dxa" w:w="4320"/>
+            <w:tcW w:type="dxa" w:w="3427"/>
+            <w:vAlign w:val="top"/>
+            <w:tcMar>
+              <w:top w:w="40" w:type="dxa"/>
+              <w:bottom w:w="90" w:type="dxa"/>
+              <w:left w:w="30" w:type="dxa"/>
+              <w:right w:w="80" w:type="dxa"/>
+            </w:tcMar>
           </w:tcPr>
           <w:p>
+            <w:pPr>
+              <w:spacing w:before="0" w:after="40" w:line="276" w:lineRule="auto"/>
+            </w:pPr>
             <w:r>
-              <w:t>Workstations and servers from Sun, HP, Microsoft Windows, various manufacturers of Linux systems</w:t>
-            </w:r>
-          </w:p>
-        </w:tc>
-      </w:tr>
-      <w:tr>
-        <w:tc>
-          <w:tcPr>
-            <w:tcW w:type="dxa" w:w="4320"/>
-          </w:tcPr>
-          <w:p>
-            <w:r>
-              <w:t>Operating Systems</w:t>
-            </w:r>
-          </w:p>
-        </w:tc>
-        <w:tc>
-          <w:tcPr>
-            <w:tcW w:type="dxa" w:w="4320"/>
-          </w:tcPr>
-          <w:p>
-            <w:r>
-              <w:t>Linux (Redhat, Centos, Ubuntu), Windows, Unix (Solaris, HP-UX), Cygwin</w:t>
-            </w:r>
-          </w:p>
-        </w:tc>
-      </w:tr>
-      <w:tr>
-        <w:tc>
-          <w:tcPr>
-            <w:tcW w:type="dxa" w:w="4320"/>
-          </w:tcPr>
-          <w:p>
-            <w:r>
+              <w:rPr>
+                <w:rFonts w:ascii="Arial" w:hAnsi="Arial"/>
+                <w:b/>
+                <w:color w:val="16A34A"/>
+                <w:sz w:val="19"/>
+              </w:rPr>
               <w:t>Networking</w:t>
             </w:r>
           </w:p>
-        </w:tc>
-        <w:tc>
-          <w:tcPr>
-            <w:tcW w:type="dxa" w:w="4320"/>
-          </w:tcPr>
           <w:p>
+            <w:pPr>
+              <w:spacing w:before="0" w:after="80" w:line="276" w:lineRule="auto"/>
+            </w:pPr>
             <w:r>
+              <w:rPr>
+                <w:rFonts w:ascii="Arial" w:hAnsi="Arial"/>
+                <w:color w:val="1F2937"/>
+                <w:sz w:val="17"/>
+              </w:rPr>
               <w:t>TCP/IP, Windows &amp; Unix Networking, Active Directory/LDAP, Samba</w:t>
             </w:r>
           </w:p>
@@ -145,64 +251,117 @@
       <w:tr>
         <w:tc>
           <w:tcPr>
-            <w:tcW w:type="dxa" w:w="4320"/>
+            <w:tcW w:type="dxa" w:w="3427"/>
+            <w:vAlign w:val="top"/>
+            <w:tcMar>
+              <w:top w:w="40" w:type="dxa"/>
+              <w:bottom w:w="90" w:type="dxa"/>
+              <w:left w:w="30" w:type="dxa"/>
+              <w:right w:w="80" w:type="dxa"/>
+            </w:tcMar>
           </w:tcPr>
           <w:p>
+            <w:pPr>
+              <w:spacing w:before="0" w:after="40" w:line="276" w:lineRule="auto"/>
+            </w:pPr>
             <w:r>
+              <w:rPr>
+                <w:rFonts w:ascii="Arial" w:hAnsi="Arial"/>
+                <w:b/>
+                <w:color w:val="16A34A"/>
+                <w:sz w:val="19"/>
+              </w:rPr>
               <w:t>Version Control</w:t>
+            </w:r>
+          </w:p>
+          <w:p>
+            <w:pPr>
+              <w:spacing w:before="0" w:after="80" w:line="276" w:lineRule="auto"/>
+            </w:pPr>
+            <w:r>
+              <w:rPr>
+                <w:rFonts w:ascii="Arial" w:hAnsi="Arial"/>
+                <w:color w:val="1F2937"/>
+                <w:sz w:val="17"/>
+              </w:rPr>
+              <w:t>Git, Perforce, Clearcase</w:t>
             </w:r>
           </w:p>
         </w:tc>
         <w:tc>
           <w:tcPr>
-            <w:tcW w:type="dxa" w:w="4320"/>
+            <w:tcW w:type="dxa" w:w="3427"/>
+            <w:vAlign w:val="top"/>
+            <w:tcMar>
+              <w:top w:w="40" w:type="dxa"/>
+              <w:bottom w:w="90" w:type="dxa"/>
+              <w:left w:w="30" w:type="dxa"/>
+              <w:right w:w="80" w:type="dxa"/>
+            </w:tcMar>
           </w:tcPr>
           <w:p>
+            <w:pPr>
+              <w:spacing w:before="0" w:after="40" w:line="276" w:lineRule="auto"/>
+            </w:pPr>
             <w:r>
-              <w:t>Git, Perforce, Clearcase</w:t>
+              <w:rPr>
+                <w:rFonts w:ascii="Arial" w:hAnsi="Arial"/>
+                <w:b/>
+                <w:color w:val="16A34A"/>
+                <w:sz w:val="19"/>
+              </w:rPr>
+              <w:t>Issue Tracking</w:t>
             </w:r>
           </w:p>
-        </w:tc>
-      </w:tr>
-      <w:tr>
-        <w:tc>
-          <w:tcPr>
-            <w:tcW w:type="dxa" w:w="4320"/>
-          </w:tcPr>
           <w:p>
+            <w:pPr>
+              <w:spacing w:before="0" w:after="80" w:line="276" w:lineRule="auto"/>
+            </w:pPr>
             <w:r>
-              <w:t>Issue Tracking</w:t>
+              <w:rPr>
+                <w:rFonts w:ascii="Arial" w:hAnsi="Arial"/>
+                <w:color w:val="1F2937"/>
+                <w:sz w:val="17"/>
+              </w:rPr>
+              <w:t>JIRA, Clearquest, Bugzilla</w:t>
             </w:r>
           </w:p>
         </w:tc>
         <w:tc>
           <w:tcPr>
-            <w:tcW w:type="dxa" w:w="4320"/>
+            <w:tcW w:type="dxa" w:w="3427"/>
+            <w:vAlign w:val="top"/>
+            <w:tcMar>
+              <w:top w:w="40" w:type="dxa"/>
+              <w:bottom w:w="90" w:type="dxa"/>
+              <w:left w:w="30" w:type="dxa"/>
+              <w:right w:w="80" w:type="dxa"/>
+            </w:tcMar>
           </w:tcPr>
           <w:p>
+            <w:pPr>
+              <w:spacing w:before="0" w:after="40" w:line="276" w:lineRule="auto"/>
+            </w:pPr>
             <w:r>
-              <w:t>JIRA, Clearquest, Bugzilla</w:t>
-            </w:r>
-          </w:p>
-        </w:tc>
-      </w:tr>
-      <w:tr>
-        <w:tc>
-          <w:tcPr>
-            <w:tcW w:type="dxa" w:w="4320"/>
-          </w:tcPr>
-          <w:p>
-            <w:r>
+              <w:rPr>
+                <w:rFonts w:ascii="Arial" w:hAnsi="Arial"/>
+                <w:b/>
+                <w:color w:val="16A34A"/>
+                <w:sz w:val="19"/>
+              </w:rPr>
               <w:t>Software Languages</w:t>
             </w:r>
           </w:p>
-        </w:tc>
-        <w:tc>
-          <w:tcPr>
-            <w:tcW w:type="dxa" w:w="4320"/>
-          </w:tcPr>
           <w:p>
+            <w:pPr>
+              <w:spacing w:before="0" w:after="80" w:line="276" w:lineRule="auto"/>
+            </w:pPr>
             <w:r>
+              <w:rPr>
+                <w:rFonts w:ascii="Arial" w:hAnsi="Arial"/>
+                <w:color w:val="1F2937"/>
+                <w:sz w:val="17"/>
+              </w:rPr>
               <w:t>Perl, Bash, PHP, C++, C, Ada, TCL</w:t>
             </w:r>
           </w:p>
@@ -211,64 +370,117 @@
       <w:tr>
         <w:tc>
           <w:tcPr>
-            <w:tcW w:type="dxa" w:w="4320"/>
+            <w:tcW w:type="dxa" w:w="3427"/>
+            <w:vAlign w:val="top"/>
+            <w:tcMar>
+              <w:top w:w="40" w:type="dxa"/>
+              <w:bottom w:w="90" w:type="dxa"/>
+              <w:left w:w="30" w:type="dxa"/>
+              <w:right w:w="80" w:type="dxa"/>
+            </w:tcMar>
           </w:tcPr>
           <w:p>
+            <w:pPr>
+              <w:spacing w:before="0" w:after="40" w:line="276" w:lineRule="auto"/>
+            </w:pPr>
             <w:r>
+              <w:rPr>
+                <w:rFonts w:ascii="Arial" w:hAnsi="Arial"/>
+                <w:b/>
+                <w:color w:val="16A34A"/>
+                <w:sz w:val="19"/>
+              </w:rPr>
               <w:t>Configuration Management</w:t>
+            </w:r>
+          </w:p>
+          <w:p>
+            <w:pPr>
+              <w:spacing w:before="0" w:after="80" w:line="276" w:lineRule="auto"/>
+            </w:pPr>
+            <w:r>
+              <w:rPr>
+                <w:rFonts w:ascii="Arial" w:hAnsi="Arial"/>
+                <w:color w:val="1F2937"/>
+                <w:sz w:val="17"/>
+              </w:rPr>
+              <w:t>Puppet, Ansible</w:t>
             </w:r>
           </w:p>
         </w:tc>
         <w:tc>
           <w:tcPr>
-            <w:tcW w:type="dxa" w:w="4320"/>
+            <w:tcW w:type="dxa" w:w="3427"/>
+            <w:vAlign w:val="top"/>
+            <w:tcMar>
+              <w:top w:w="40" w:type="dxa"/>
+              <w:bottom w:w="90" w:type="dxa"/>
+              <w:left w:w="30" w:type="dxa"/>
+              <w:right w:w="80" w:type="dxa"/>
+            </w:tcMar>
           </w:tcPr>
           <w:p>
+            <w:pPr>
+              <w:spacing w:before="0" w:after="40" w:line="276" w:lineRule="auto"/>
+            </w:pPr>
             <w:r>
-              <w:t>Puppet, Ansible</w:t>
+              <w:rPr>
+                <w:rFonts w:ascii="Arial" w:hAnsi="Arial"/>
+                <w:b/>
+                <w:color w:val="16A34A"/>
+                <w:sz w:val="19"/>
+              </w:rPr>
+              <w:t>Middleware</w:t>
             </w:r>
           </w:p>
-        </w:tc>
-      </w:tr>
-      <w:tr>
-        <w:tc>
-          <w:tcPr>
-            <w:tcW w:type="dxa" w:w="4320"/>
-          </w:tcPr>
           <w:p>
+            <w:pPr>
+              <w:spacing w:before="0" w:after="80" w:line="276" w:lineRule="auto"/>
+            </w:pPr>
             <w:r>
-              <w:t>Middleware</w:t>
+              <w:rPr>
+                <w:rFonts w:ascii="Arial" w:hAnsi="Arial"/>
+                <w:color w:val="1F2937"/>
+                <w:sz w:val="17"/>
+              </w:rPr>
+              <w:t>Apache, Tomcat, Samba, Winbind, LDAP, REST</w:t>
             </w:r>
           </w:p>
         </w:tc>
         <w:tc>
           <w:tcPr>
-            <w:tcW w:type="dxa" w:w="4320"/>
+            <w:tcW w:type="dxa" w:w="3427"/>
+            <w:vAlign w:val="top"/>
+            <w:tcMar>
+              <w:top w:w="40" w:type="dxa"/>
+              <w:bottom w:w="90" w:type="dxa"/>
+              <w:left w:w="30" w:type="dxa"/>
+              <w:right w:w="80" w:type="dxa"/>
+            </w:tcMar>
           </w:tcPr>
           <w:p>
+            <w:pPr>
+              <w:spacing w:before="0" w:after="40" w:line="276" w:lineRule="auto"/>
+            </w:pPr>
             <w:r>
-              <w:t>Apache, Tomcat, Samba, Winbind, LDAP, REST</w:t>
-            </w:r>
-          </w:p>
-        </w:tc>
-      </w:tr>
-      <w:tr>
-        <w:tc>
-          <w:tcPr>
-            <w:tcW w:type="dxa" w:w="4320"/>
-          </w:tcPr>
-          <w:p>
-            <w:r>
+              <w:rPr>
+                <w:rFonts w:ascii="Arial" w:hAnsi="Arial"/>
+                <w:b/>
+                <w:color w:val="16A34A"/>
+                <w:sz w:val="19"/>
+              </w:rPr>
               <w:t>Web Apps</w:t>
             </w:r>
           </w:p>
-        </w:tc>
-        <w:tc>
-          <w:tcPr>
-            <w:tcW w:type="dxa" w:w="4320"/>
-          </w:tcPr>
           <w:p>
+            <w:pPr>
+              <w:spacing w:before="0" w:after="80" w:line="276" w:lineRule="auto"/>
+            </w:pPr>
             <w:r>
+              <w:rPr>
+                <w:rFonts w:ascii="Arial" w:hAnsi="Arial"/>
+                <w:color w:val="1F2937"/>
+                <w:sz w:val="17"/>
+              </w:rPr>
               <w:t>JIRA, Confluence, Swarm</w:t>
             </w:r>
           </w:p>
@@ -277,64 +489,117 @@
       <w:tr>
         <w:tc>
           <w:tcPr>
-            <w:tcW w:type="dxa" w:w="4320"/>
+            <w:tcW w:type="dxa" w:w="3427"/>
+            <w:vAlign w:val="top"/>
+            <w:tcMar>
+              <w:top w:w="40" w:type="dxa"/>
+              <w:bottom w:w="90" w:type="dxa"/>
+              <w:left w:w="30" w:type="dxa"/>
+              <w:right w:w="80" w:type="dxa"/>
+            </w:tcMar>
           </w:tcPr>
           <w:p>
+            <w:pPr>
+              <w:spacing w:before="0" w:after="40" w:line="276" w:lineRule="auto"/>
+            </w:pPr>
             <w:r>
+              <w:rPr>
+                <w:rFonts w:ascii="Arial" w:hAnsi="Arial"/>
+                <w:b/>
+                <w:color w:val="16A34A"/>
+                <w:sz w:val="19"/>
+              </w:rPr>
               <w:t>Databases</w:t>
+            </w:r>
+          </w:p>
+          <w:p>
+            <w:pPr>
+              <w:spacing w:before="0" w:after="80" w:line="276" w:lineRule="auto"/>
+            </w:pPr>
+            <w:r>
+              <w:rPr>
+                <w:rFonts w:ascii="Arial" w:hAnsi="Arial"/>
+                <w:color w:val="1F2937"/>
+                <w:sz w:val="17"/>
+              </w:rPr>
+              <w:t>MySQL, Oracle</w:t>
             </w:r>
           </w:p>
         </w:tc>
         <w:tc>
           <w:tcPr>
-            <w:tcW w:type="dxa" w:w="4320"/>
+            <w:tcW w:type="dxa" w:w="3427"/>
+            <w:vAlign w:val="top"/>
+            <w:tcMar>
+              <w:top w:w="40" w:type="dxa"/>
+              <w:bottom w:w="90" w:type="dxa"/>
+              <w:left w:w="30" w:type="dxa"/>
+              <w:right w:w="80" w:type="dxa"/>
+            </w:tcMar>
           </w:tcPr>
           <w:p>
+            <w:pPr>
+              <w:spacing w:before="0" w:after="40" w:line="276" w:lineRule="auto"/>
+            </w:pPr>
             <w:r>
-              <w:t>MySQL, Oracle</w:t>
+              <w:rPr>
+                <w:rFonts w:ascii="Arial" w:hAnsi="Arial"/>
+                <w:b/>
+                <w:color w:val="16A34A"/>
+                <w:sz w:val="19"/>
+              </w:rPr>
+              <w:t>CI/CD</w:t>
             </w:r>
           </w:p>
-        </w:tc>
-      </w:tr>
-      <w:tr>
-        <w:tc>
-          <w:tcPr>
-            <w:tcW w:type="dxa" w:w="4320"/>
-          </w:tcPr>
           <w:p>
+            <w:pPr>
+              <w:spacing w:before="0" w:after="80" w:line="276" w:lineRule="auto"/>
+            </w:pPr>
             <w:r>
-              <w:t>CI/CD</w:t>
+              <w:rPr>
+                <w:rFonts w:ascii="Arial" w:hAnsi="Arial"/>
+                <w:color w:val="1F2937"/>
+                <w:sz w:val="17"/>
+              </w:rPr>
+              <w:t>Jenkins, Electric Commander</w:t>
             </w:r>
           </w:p>
         </w:tc>
         <w:tc>
           <w:tcPr>
-            <w:tcW w:type="dxa" w:w="4320"/>
+            <w:tcW w:type="dxa" w:w="3427"/>
+            <w:vAlign w:val="top"/>
+            <w:tcMar>
+              <w:top w:w="40" w:type="dxa"/>
+              <w:bottom w:w="90" w:type="dxa"/>
+              <w:left w:w="30" w:type="dxa"/>
+              <w:right w:w="80" w:type="dxa"/>
+            </w:tcMar>
           </w:tcPr>
           <w:p>
+            <w:pPr>
+              <w:spacing w:before="0" w:after="40" w:line="276" w:lineRule="auto"/>
+            </w:pPr>
             <w:r>
-              <w:t>Jenkins, Electric Commander</w:t>
-            </w:r>
-          </w:p>
-        </w:tc>
-      </w:tr>
-      <w:tr>
-        <w:tc>
-          <w:tcPr>
-            <w:tcW w:type="dxa" w:w="4320"/>
-          </w:tcPr>
-          <w:p>
-            <w:r>
+              <w:rPr>
+                <w:rFonts w:ascii="Arial" w:hAnsi="Arial"/>
+                <w:b/>
+                <w:color w:val="16A34A"/>
+                <w:sz w:val="19"/>
+              </w:rPr>
               <w:t>Virtualization</w:t>
             </w:r>
           </w:p>
-        </w:tc>
-        <w:tc>
-          <w:tcPr>
-            <w:tcW w:type="dxa" w:w="4320"/>
-          </w:tcPr>
           <w:p>
+            <w:pPr>
+              <w:spacing w:before="0" w:after="80" w:line="276" w:lineRule="auto"/>
+            </w:pPr>
             <w:r>
+              <w:rPr>
+                <w:rFonts w:ascii="Arial" w:hAnsi="Arial"/>
+                <w:color w:val="1F2937"/>
+                <w:sz w:val="17"/>
+              </w:rPr>
               <w:t>VMWare, VirtualBox, vSphere, vCenter</w:t>
             </w:r>
           </w:p>
@@ -343,456 +608,1743 @@
       <w:tr>
         <w:tc>
           <w:tcPr>
-            <w:tcW w:type="dxa" w:w="4320"/>
+            <w:tcW w:type="dxa" w:w="3427"/>
+            <w:vAlign w:val="top"/>
+            <w:tcMar>
+              <w:top w:w="40" w:type="dxa"/>
+              <w:bottom w:w="90" w:type="dxa"/>
+              <w:left w:w="30" w:type="dxa"/>
+              <w:right w:w="80" w:type="dxa"/>
+            </w:tcMar>
           </w:tcPr>
           <w:p>
+            <w:pPr>
+              <w:spacing w:before="0" w:after="40" w:line="276" w:lineRule="auto"/>
+            </w:pPr>
             <w:r>
+              <w:rPr>
+                <w:rFonts w:ascii="Arial" w:hAnsi="Arial"/>
+                <w:b/>
+                <w:color w:val="16A34A"/>
+                <w:sz w:val="19"/>
+              </w:rPr>
               <w:t>Cloud Computing</w:t>
+            </w:r>
+          </w:p>
+          <w:p>
+            <w:pPr>
+              <w:spacing w:before="0" w:after="80" w:line="276" w:lineRule="auto"/>
+            </w:pPr>
+            <w:r>
+              <w:rPr>
+                <w:rFonts w:ascii="Arial" w:hAnsi="Arial"/>
+                <w:color w:val="1F2937"/>
+                <w:sz w:val="17"/>
+              </w:rPr>
+              <w:t>(Classroom Only) EC2, IAM, S3, CloudFront, Route53, VPC, Docker</w:t>
             </w:r>
           </w:p>
         </w:tc>
         <w:tc>
           <w:tcPr>
-            <w:tcW w:type="dxa" w:w="4320"/>
+            <w:tcW w:type="dxa" w:w="3427"/>
+            <w:vAlign w:val="top"/>
+            <w:tcMar>
+              <w:top w:w="40" w:type="dxa"/>
+              <w:bottom w:w="90" w:type="dxa"/>
+              <w:left w:w="30" w:type="dxa"/>
+              <w:right w:w="80" w:type="dxa"/>
+            </w:tcMar>
           </w:tcPr>
-          <w:p>
-            <w:r>
-              <w:t>EC2, IAM, S3, CloudFront, Route53, VPC, Docker</w:t>
-            </w:r>
-          </w:p>
+          <w:p/>
+        </w:tc>
+        <w:tc>
+          <w:tcPr>
+            <w:tcW w:type="dxa" w:w="3427"/>
+            <w:vAlign w:val="top"/>
+            <w:tcMar>
+              <w:top w:w="40" w:type="dxa"/>
+              <w:bottom w:w="90" w:type="dxa"/>
+              <w:left w:w="30" w:type="dxa"/>
+              <w:right w:w="80" w:type="dxa"/>
+            </w:tcMar>
+          </w:tcPr>
+          <w:p/>
         </w:tc>
       </w:tr>
     </w:tbl>
     <w:p>
       <w:pPr>
-        <w:pStyle w:val="Heading1"/>
+        <w:keepNext/>
+        <w:spacing w:before="200" w:after="80"/>
       </w:pPr>
       <w:r>
-        <w:t>Professional Experience</w:t>
-      </w:r>
-    </w:p>
-    <w:p>
-      <w:pPr/>
-      <w:r>
         <w:rPr>
+          <w:rFonts w:ascii="Arial" w:hAnsi="Arial"/>
           <w:b/>
+          <w:color w:val="3B82F6"/>
+          <w:sz w:val="23"/>
         </w:rPr>
-        <w:t>SCM / Systems Engineering Consultant | ABS Consulting (Client: Cohu) | CA</w:t>
-        <w:br/>
-      </w:r>
-      <w:r>
-        <w:rPr>
-          <w:b w:val="0"/>
-        </w:rPr>
-        <w:t>June 2026 - Present</w:t>
+        <w:t>EXPERIENCE</w:t>
       </w:r>
     </w:p>
     <w:p>
       <w:pPr>
-        <w:pStyle w:val="ListBullet"/>
+        <w:keepNext/>
+        <w:spacing w:before="140" w:after="20" w:line="276" w:lineRule="auto"/>
+        <w:ind w:left="0" w:firstLine="0"/>
       </w:pPr>
       <w:r>
-        <w:t>Architecting and executing migration of enterprise IBM Rational ClearCase VOBs and multi-branch repositories to modern Git (cohu1 / cohu2 migration infrastructure).</w:t>
+        <w:rPr>
+          <w:rFonts w:ascii="Arial" w:hAnsi="Arial"/>
+          <w:b/>
+          <w:color w:val="DC2626"/>
+          <w:sz w:val="19"/>
+        </w:rPr>
+        <w:t>SCM / Systems Engineering Consultant | June 2026 - Present</w:t>
       </w:r>
     </w:p>
     <w:p>
       <w:pPr>
-        <w:pStyle w:val="ListBullet"/>
+        <w:keepNext/>
+        <w:spacing w:before="0" w:after="40" w:line="276" w:lineRule="auto"/>
+        <w:ind w:left="0" w:firstLine="0"/>
       </w:pPr>
       <w:r>
-        <w:t>Designing automated branching strategies, historical metadata preservation, merge conflict workflows, and CI/CD pipeline integration.</w:t>
+        <w:rPr>
+          <w:rFonts w:ascii="Arial" w:hAnsi="Arial"/>
+          <w:b/>
+          <w:color w:val="374151"/>
+          <w:sz w:val="18"/>
+        </w:rPr>
+        <w:t>ABS Consulting (Client: Cohu) | CA</w:t>
       </w:r>
     </w:p>
     <w:p>
       <w:pPr>
-        <w:pStyle w:val="ListBullet"/>
+        <w:tabs>
+          <w:tab w:pos="400" w:val="left"/>
+        </w:tabs>
+        <w:spacing w:before="0" w:after="44" w:line="276" w:lineRule="auto"/>
+        <w:ind w:left="400" w:hanging="200"/>
       </w:pPr>
       <w:r>
-        <w:t>Administering Linux migration hosts, build automation environments, and developer tooling.</w:t>
-      </w:r>
-    </w:p>
-    <w:p>
-      <w:pPr/>
-      <w:r>
         <w:rPr>
-          <w:b/>
+          <w:rFonts w:ascii="Arial" w:hAnsi="Arial"/>
+          <w:color w:val="6B7280"/>
+          <w:sz w:val="17"/>
         </w:rPr>
-        <w:t>Senior Perl / Software Systems Engineer (Contract) | Wolters Kluwer | Remote</w:t>
-        <w:br/>
+        <w:t>•</w:t>
+        <w:tab/>
       </w:r>
       <w:r>
         <w:rPr>
-          <w:b w:val="0"/>
+          <w:rFonts w:ascii="Arial" w:hAnsi="Arial"/>
+          <w:color w:val="1F2937"/>
+          <w:sz w:val="17"/>
         </w:rPr>
-        <w:t>March 2026 - August 2026</w:t>
+        <w:t>Architecting and executing migration of enterprise IBM Rational ClearCase VOBs and multi-branch repositories to modern Git (cohu1 / cohu2 migration infrastructure)</w:t>
       </w:r>
     </w:p>
     <w:p>
       <w:pPr>
-        <w:pStyle w:val="ListBullet"/>
+        <w:tabs>
+          <w:tab w:pos="400" w:val="left"/>
+        </w:tabs>
+        <w:spacing w:before="0" w:after="44" w:line="276" w:lineRule="auto"/>
+        <w:ind w:left="400" w:hanging="200"/>
       </w:pPr>
       <w:r>
-        <w:t>Maintained, modernized, and optimized core enterprise backend applications running on Amazon Linux, Apache, and mod_perl.</w:t>
+        <w:rPr>
+          <w:rFonts w:ascii="Arial" w:hAnsi="Arial"/>
+          <w:color w:val="6B7280"/>
+          <w:sz w:val="17"/>
+        </w:rPr>
+        <w:t>•</w:t>
+        <w:tab/>
+      </w:r>
+      <w:r>
+        <w:rPr>
+          <w:rFonts w:ascii="Arial" w:hAnsi="Arial"/>
+          <w:color w:val="1F2937"/>
+          <w:sz w:val="17"/>
+        </w:rPr>
+        <w:t>Designing automated branching strategies, historical metadata preservation, merge conflict workflows, and CI/CD pipeline integration</w:t>
       </w:r>
     </w:p>
     <w:p>
       <w:pPr>
-        <w:pStyle w:val="ListBullet"/>
+        <w:tabs>
+          <w:tab w:pos="400" w:val="left"/>
+        </w:tabs>
+        <w:spacing w:before="0" w:after="44" w:line="276" w:lineRule="auto"/>
+        <w:ind w:left="400" w:hanging="200"/>
       </w:pPr>
       <w:r>
-        <w:t>Diagnosed and resolved critical production memory exhaustion and child-process management/reaping issues across high-volume Linux service infrastructure.</w:t>
+        <w:rPr>
+          <w:rFonts w:ascii="Arial" w:hAnsi="Arial"/>
+          <w:color w:val="6B7280"/>
+          <w:sz w:val="17"/>
+        </w:rPr>
+        <w:t>•</w:t>
+        <w:tab/>
+      </w:r>
+      <w:r>
+        <w:rPr>
+          <w:rFonts w:ascii="Arial" w:hAnsi="Arial"/>
+          <w:color w:val="1F2937"/>
+          <w:sz w:val="17"/>
+        </w:rPr>
+        <w:t>Administering Linux migration hosts, build automation environments, and developer tooling</w:t>
       </w:r>
     </w:p>
     <w:p>
       <w:pPr>
-        <w:pStyle w:val="ListBullet"/>
+        <w:keepNext/>
+        <w:spacing w:before="140" w:after="20" w:line="276" w:lineRule="auto"/>
+        <w:ind w:left="0" w:firstLine="0"/>
       </w:pPr>
       <w:r>
-        <w:t>Evaluated modern migration paths from legacy Amazon Linux 2 / Apache 2.2 / OpenSSL to Amazon Linux 2023, Nginx, and containerized Docker development environments.</w:t>
+        <w:rPr>
+          <w:rFonts w:ascii="Arial" w:hAnsi="Arial"/>
+          <w:b/>
+          <w:color w:val="DC2626"/>
+          <w:sz w:val="19"/>
+        </w:rPr>
+        <w:t>Senior Linux / SCM &amp; Perl Consultant | July 2026 - September 2026</w:t>
       </w:r>
     </w:p>
     <w:p>
       <w:pPr>
-        <w:pStyle w:val="ListBullet"/>
+        <w:keepNext/>
+        <w:spacing w:before="0" w:after="40" w:line="276" w:lineRule="auto"/>
+        <w:ind w:left="0" w:firstLine="0"/>
       </w:pPr>
       <w:r>
-        <w:t>Engineered Jenkins CI/CD automation pipelines, telemetry integration (OpenTelemetry, New Relic), and security vulnerability scanning (Black Duck).</w:t>
+        <w:rPr>
+          <w:rFonts w:ascii="Arial" w:hAnsi="Arial"/>
+          <w:b/>
+          <w:color w:val="374151"/>
+          <w:sz w:val="18"/>
+        </w:rPr>
+        <w:t>ABS Consulting | Remote</w:t>
       </w:r>
     </w:p>
     <w:p>
       <w:pPr>
-        <w:pStyle w:val="ListBullet"/>
+        <w:tabs>
+          <w:tab w:pos="400" w:val="left"/>
+        </w:tabs>
+        <w:spacing w:before="0" w:after="44" w:line="276" w:lineRule="auto"/>
+        <w:ind w:left="400" w:hanging="200"/>
       </w:pPr>
       <w:r>
-        <w:t>Integrated full-stack REST services, Redis caching layers, NFS network storage, and dynamic frontend web components.</w:t>
-      </w:r>
-    </w:p>
-    <w:p>
-      <w:pPr/>
-      <w:r>
         <w:rPr>
-          <w:b/>
+          <w:rFonts w:ascii="Arial" w:hAnsi="Arial"/>
+          <w:color w:val="6B7280"/>
+          <w:sz w:val="17"/>
         </w:rPr>
-        <w:t>SCM / Systems Consultant | ABS Consulting (Client: Xtera) | CA</w:t>
-        <w:br/>
+        <w:t>•</w:t>
+        <w:tab/>
       </w:r>
       <w:r>
         <w:rPr>
-          <w:b w:val="0"/>
+          <w:rFonts w:ascii="Arial" w:hAnsi="Arial"/>
+          <w:color w:val="1F2937"/>
+          <w:sz w:val="17"/>
         </w:rPr>
-        <w:t>April 2025 - November 2025</w:t>
+        <w:t>Modernized legacy ClearCase infrastructure and integrated automated deployment and health-check workflows</w:t>
       </w:r>
     </w:p>
     <w:p>
       <w:pPr>
-        <w:pStyle w:val="ListBullet"/>
+        <w:tabs>
+          <w:tab w:pos="400" w:val="left"/>
+        </w:tabs>
+        <w:spacing w:before="0" w:after="44" w:line="276" w:lineRule="auto"/>
+        <w:ind w:left="400" w:hanging="200"/>
       </w:pPr>
       <w:r>
-        <w:t>Delivered SCM architecture, build &amp; release engineering, and Linux infrastructure automation for optical networking systems.</w:t>
+        <w:rPr>
+          <w:rFonts w:ascii="Arial" w:hAnsi="Arial"/>
+          <w:color w:val="6B7280"/>
+          <w:sz w:val="17"/>
+        </w:rPr>
+        <w:t>•</w:t>
+        <w:tab/>
+      </w:r>
+      <w:r>
+        <w:rPr>
+          <w:rFonts w:ascii="Arial" w:hAnsi="Arial"/>
+          <w:color w:val="1F2937"/>
+          <w:sz w:val="17"/>
+        </w:rPr>
+        <w:t>Engineered a Perl-based administrative dashboard and web monitoring suite (ClearMonitor) for real-time repository health, trigger management, and remote execution</w:t>
       </w:r>
     </w:p>
     <w:p>
       <w:pPr>
-        <w:pStyle w:val="ListBullet"/>
+        <w:tabs>
+          <w:tab w:pos="400" w:val="left"/>
+        </w:tabs>
+        <w:spacing w:before="0" w:after="44" w:line="276" w:lineRule="auto"/>
+        <w:ind w:left="400" w:hanging="200"/>
       </w:pPr>
       <w:r>
-        <w:t>Streamlined version control workflows (Git / ClearCase), continuous integration, and automated packaging/deployment scripts.</w:t>
-      </w:r>
-    </w:p>
-    <w:p>
-      <w:r>
         <w:rPr>
-          <w:b/>
+          <w:rFonts w:ascii="Arial" w:hAnsi="Arial"/>
+          <w:color w:val="6B7280"/>
+          <w:sz w:val="17"/>
         </w:rPr>
-        <w:t>Perl Developer | Cpanel/WebPros | CA</w:t>
-        <w:br/>
+        <w:t>•</w:t>
+        <w:tab/>
       </w:r>
       <w:r>
         <w:rPr>
-          <w:i/>
+          <w:rFonts w:ascii="Arial" w:hAnsi="Arial"/>
+          <w:color w:val="1F2937"/>
+          <w:sz w:val="17"/>
         </w:rPr>
-        <w:t>October 2021 - May 2024</w:t>
+        <w:t>Utilized AI-assisted engineering and modern tooling to accelerate delivery, refactor legacy scripts, and generate automated diagnostic tests</w:t>
       </w:r>
     </w:p>
     <w:p>
       <w:pPr>
-        <w:pStyle w:val="ListBullet"/>
+        <w:keepNext/>
+        <w:spacing w:before="140" w:after="20" w:line="276" w:lineRule="auto"/>
+        <w:ind w:left="0" w:firstLine="0"/>
       </w:pPr>
       <w:r>
-        <w:t>Worked on the Artemis Team, improving WHM and learning Cpanel's extensive code base.</w:t>
+        <w:rPr>
+          <w:rFonts w:ascii="Arial" w:hAnsi="Arial"/>
+          <w:b/>
+          <w:color w:val="DC2626"/>
+          <w:sz w:val="19"/>
+        </w:rPr>
+        <w:t>Senior Perl / Software Systems Engineer (Contract) | March 2026 - August 2026</w:t>
       </w:r>
     </w:p>
     <w:p>
       <w:pPr>
-        <w:pStyle w:val="ListBullet"/>
+        <w:keepNext/>
+        <w:spacing w:before="0" w:after="40" w:line="276" w:lineRule="auto"/>
+        <w:ind w:left="0" w:firstLine="0"/>
       </w:pPr>
       <w:r>
-        <w:t>Transitioned to the Release Team, focusing on bug fixes and release tasks.</w:t>
+        <w:rPr>
+          <w:rFonts w:ascii="Arial" w:hAnsi="Arial"/>
+          <w:b/>
+          <w:color w:val="374151"/>
+          <w:sz w:val="18"/>
+        </w:rPr>
+        <w:t>Wolters Kluwer (via Addison Group) | Remote</w:t>
       </w:r>
     </w:p>
     <w:p>
       <w:pPr>
-        <w:pStyle w:val="ListBullet"/>
+        <w:tabs>
+          <w:tab w:pos="400" w:val="left"/>
+        </w:tabs>
+        <w:spacing w:before="0" w:after="44" w:line="276" w:lineRule="auto"/>
+        <w:ind w:left="400" w:hanging="200"/>
       </w:pPr>
       <w:r>
-        <w:t>Contributed to the WordPress Squared team, enhancing backend functionality with bug fixes and improvements.</w:t>
+        <w:rPr>
+          <w:rFonts w:ascii="Arial" w:hAnsi="Arial"/>
+          <w:color w:val="6B7280"/>
+          <w:sz w:val="17"/>
+        </w:rPr>
+        <w:t>•</w:t>
+        <w:tab/>
+      </w:r>
+      <w:r>
+        <w:rPr>
+          <w:rFonts w:ascii="Arial" w:hAnsi="Arial"/>
+          <w:color w:val="1F2937"/>
+          <w:sz w:val="17"/>
+        </w:rPr>
+        <w:t>Maintained, modernized, and optimized core enterprise backend applications running on Amazon Linux, Apache, and mod_perl</w:t>
       </w:r>
     </w:p>
     <w:p>
       <w:pPr>
-        <w:pStyle w:val="ListBullet"/>
+        <w:tabs>
+          <w:tab w:pos="400" w:val="left"/>
+        </w:tabs>
+        <w:spacing w:before="0" w:after="44" w:line="276" w:lineRule="auto"/>
+        <w:ind w:left="400" w:hanging="200"/>
       </w:pPr>
       <w:r>
-        <w:t>Conducted quality assurance and integration testing for project readiness.</w:t>
+        <w:rPr>
+          <w:rFonts w:ascii="Arial" w:hAnsi="Arial"/>
+          <w:color w:val="6B7280"/>
+          <w:sz w:val="17"/>
+        </w:rPr>
+        <w:t>•</w:t>
+        <w:tab/>
+      </w:r>
+      <w:r>
+        <w:rPr>
+          <w:rFonts w:ascii="Arial" w:hAnsi="Arial"/>
+          <w:color w:val="1F2937"/>
+          <w:sz w:val="17"/>
+        </w:rPr>
+        <w:t>Diagnosed and resolved critical production memory exhaustion and child-process management/reaping issues across high-volume Linux service infrastructure</w:t>
       </w:r>
     </w:p>
     <w:p>
       <w:pPr>
-        <w:pStyle w:val="ListBullet"/>
+        <w:tabs>
+          <w:tab w:pos="400" w:val="left"/>
+        </w:tabs>
+        <w:spacing w:before="0" w:after="44" w:line="276" w:lineRule="auto"/>
+        <w:ind w:left="400" w:hanging="200"/>
       </w:pPr>
       <w:r>
-        <w:t>Developed software applications to enhance client satisfaction and user experience.</w:t>
-      </w:r>
-    </w:p>
-    <w:p>
-      <w:r>
         <w:rPr>
-          <w:b/>
+          <w:rFonts w:ascii="Arial" w:hAnsi="Arial"/>
+          <w:color w:val="6B7280"/>
+          <w:sz w:val="17"/>
         </w:rPr>
-        <w:t>Engineer Consultant | ClearSCM, Inc | CA</w:t>
-        <w:br/>
+        <w:t>•</w:t>
+        <w:tab/>
       </w:r>
       <w:r>
         <w:rPr>
-          <w:i/>
+          <w:rFonts w:ascii="Arial" w:hAnsi="Arial"/>
+          <w:color w:val="1F2937"/>
+          <w:sz w:val="17"/>
         </w:rPr>
-        <w:t>July 2007 - September 2021</w:t>
+        <w:t>Evaluated modern migration paths from legacy Amazon Linux 2 / Apache 2.2 / OpenSSL to Amazon Linux 2023, Nginx, and containerized Docker development environments</w:t>
       </w:r>
     </w:p>
     <w:p>
       <w:pPr>
-        <w:pStyle w:val="ListBullet"/>
+        <w:tabs>
+          <w:tab w:pos="400" w:val="left"/>
+        </w:tabs>
+        <w:spacing w:before="0" w:after="44" w:line="276" w:lineRule="auto"/>
+        <w:ind w:left="400" w:hanging="200"/>
       </w:pPr>
       <w:r>
-        <w:t>Ran a consulting firm specializing in Build Engineering, Linux Administration and Version Control Systems.</w:t>
+        <w:rPr>
+          <w:rFonts w:ascii="Arial" w:hAnsi="Arial"/>
+          <w:color w:val="6B7280"/>
+          <w:sz w:val="17"/>
+        </w:rPr>
+        <w:t>•</w:t>
+        <w:tab/>
+      </w:r>
+      <w:r>
+        <w:rPr>
+          <w:rFonts w:ascii="Arial" w:hAnsi="Arial"/>
+          <w:color w:val="1F2937"/>
+          <w:sz w:val="17"/>
+        </w:rPr>
+        <w:t>Engineered Jenkins CI/CD automation pipelines, telemetry integration (OpenTelemetry, New Relic), and security vulnerability scanning (Black Duck)</w:t>
       </w:r>
     </w:p>
     <w:p>
       <w:pPr>
-        <w:pStyle w:val="ListBullet"/>
+        <w:tabs>
+          <w:tab w:pos="400" w:val="left"/>
+        </w:tabs>
+        <w:spacing w:before="0" w:after="44" w:line="276" w:lineRule="auto"/>
+        <w:ind w:left="400" w:hanging="200"/>
       </w:pPr>
       <w:r>
-        <w:t>Provided services to many clients like Wells Fargo, General Dynamics, Broadcom, ICANN, and General Electric.</w:t>
+        <w:rPr>
+          <w:rFonts w:ascii="Arial" w:hAnsi="Arial"/>
+          <w:color w:val="6B7280"/>
+          <w:sz w:val="17"/>
+        </w:rPr>
+        <w:t>•</w:t>
+        <w:tab/>
+      </w:r>
+      <w:r>
+        <w:rPr>
+          <w:rFonts w:ascii="Arial" w:hAnsi="Arial"/>
+          <w:color w:val="1F2937"/>
+          <w:sz w:val="17"/>
+        </w:rPr>
+        <w:t>Integrated full-stack REST services, Redis caching layers, NFS network storage, and dynamic frontend web components</w:t>
       </w:r>
     </w:p>
     <w:p>
       <w:pPr>
-        <w:pStyle w:val="ListBullet"/>
+        <w:tabs>
+          <w:tab w:pos="400" w:val="left"/>
+        </w:tabs>
+        <w:spacing w:before="0" w:after="44" w:line="276" w:lineRule="auto"/>
+        <w:ind w:left="400" w:hanging="200"/>
       </w:pPr>
       <w:r>
-        <w:t>Served as a Perl developer writing scripts automating tasks in build systems, test systems, and complete applications.</w:t>
+        <w:rPr>
+          <w:rFonts w:ascii="Arial" w:hAnsi="Arial"/>
+          <w:color w:val="6B7280"/>
+          <w:sz w:val="17"/>
+        </w:rPr>
+        <w:t>•</w:t>
+        <w:tab/>
+      </w:r>
+      <w:r>
+        <w:rPr>
+          <w:rFonts w:ascii="Arial" w:hAnsi="Arial"/>
+          <w:color w:val="1F2937"/>
+          <w:sz w:val="17"/>
+        </w:rPr>
+        <w:t>Collaborated with distributed engineering teams on code reviews, API integrations, and release readiness</w:t>
       </w:r>
     </w:p>
     <w:p>
       <w:pPr>
-        <w:pStyle w:val="ListBullet"/>
+        <w:keepNext/>
+        <w:spacing w:before="140" w:after="20" w:line="276" w:lineRule="auto"/>
+        <w:ind w:left="0" w:firstLine="0"/>
       </w:pPr>
       <w:r>
-        <w:t>Administered subsystems like Puppet/Ansible, Clearcase/Clearquest, Git, Perforce, Jenkins, and JIRA.</w:t>
+        <w:rPr>
+          <w:rFonts w:ascii="Arial" w:hAnsi="Arial"/>
+          <w:b/>
+          <w:color w:val="DC2626"/>
+          <w:sz w:val="19"/>
+        </w:rPr>
+        <w:t>SCM / Systems Consultant | April 2025 - November 2025</w:t>
       </w:r>
     </w:p>
     <w:p>
       <w:pPr>
-        <w:pStyle w:val="ListBullet"/>
+        <w:keepNext/>
+        <w:spacing w:before="0" w:after="40" w:line="276" w:lineRule="auto"/>
+        <w:ind w:left="0" w:firstLine="0"/>
       </w:pPr>
       <w:r>
-        <w:t>Specialized in Linux administration.</w:t>
-      </w:r>
-    </w:p>
-    <w:p>
-      <w:r>
         <w:rPr>
+          <w:rFonts w:ascii="Arial" w:hAnsi="Arial"/>
           <w:b/>
+          <w:color w:val="374151"/>
+          <w:sz w:val="18"/>
         </w:rPr>
-        <w:t>Clearcase/Clearquest Administrator | DeFaria.com | CA</w:t>
-        <w:br/>
-      </w:r>
-      <w:r>
-        <w:rPr>
-          <w:i/>
-        </w:rPr>
-        <w:t>February 2004 - June 2007</w:t>
+        <w:t>ABS Consulting (Client: Xtera) | CA</w:t>
       </w:r>
     </w:p>
     <w:p>
       <w:pPr>
-        <w:pStyle w:val="ListBullet"/>
+        <w:tabs>
+          <w:tab w:pos="400" w:val="left"/>
+        </w:tabs>
+        <w:spacing w:before="0" w:after="44" w:line="276" w:lineRule="auto"/>
+        <w:ind w:left="400" w:hanging="200"/>
       </w:pPr>
       <w:r>
-        <w:t>Consulted for clients including Hewlett Packard, Broadcom, Lynuxworks, and Ameriquest.</w:t>
+        <w:rPr>
+          <w:rFonts w:ascii="Arial" w:hAnsi="Arial"/>
+          <w:color w:val="6B7280"/>
+          <w:sz w:val="17"/>
+        </w:rPr>
+        <w:t>•</w:t>
+        <w:tab/>
+      </w:r>
+      <w:r>
+        <w:rPr>
+          <w:rFonts w:ascii="Arial" w:hAnsi="Arial"/>
+          <w:color w:val="1F2937"/>
+          <w:sz w:val="17"/>
+        </w:rPr>
+        <w:t>Delivered SCM architecture, build &amp; release engineering, and Linux infrastructure automation for optical networking systems</w:t>
       </w:r>
     </w:p>
     <w:p>
       <w:pPr>
-        <w:pStyle w:val="ListBullet"/>
+        <w:tabs>
+          <w:tab w:pos="400" w:val="left"/>
+        </w:tabs>
+        <w:spacing w:before="0" w:after="44" w:line="276" w:lineRule="auto"/>
+        <w:ind w:left="400" w:hanging="200"/>
       </w:pPr>
       <w:r>
-        <w:t>Specialized in Build Release engineering, Clearcase/Clearquest engineering, and system security hardening.</w:t>
+        <w:rPr>
+          <w:rFonts w:ascii="Arial" w:hAnsi="Arial"/>
+          <w:color w:val="6B7280"/>
+          <w:sz w:val="17"/>
+        </w:rPr>
+        <w:t>•</w:t>
+        <w:tab/>
+      </w:r>
+      <w:r>
+        <w:rPr>
+          <w:rFonts w:ascii="Arial" w:hAnsi="Arial"/>
+          <w:color w:val="1F2937"/>
+          <w:sz w:val="17"/>
+        </w:rPr>
+        <w:t>Streamlined version control workflows (Git / ClearCase), continuous integration, and automated packaging/deployment scripts</w:t>
       </w:r>
     </w:p>
     <w:p>
       <w:pPr>
-        <w:pStyle w:val="ListBullet"/>
+        <w:keepNext/>
+        <w:spacing w:before="140" w:after="20" w:line="276" w:lineRule="auto"/>
+        <w:ind w:left="0" w:firstLine="0"/>
       </w:pPr>
       <w:r>
-        <w:t>Addressed customer inquiries and resolved issues promptly.</w:t>
+        <w:rPr>
+          <w:rFonts w:ascii="Arial" w:hAnsi="Arial"/>
+          <w:b/>
+          <w:color w:val="DC2626"/>
+          <w:sz w:val="19"/>
+        </w:rPr>
+        <w:t>Perl Developer | October 2021 - May 2024</w:t>
       </w:r>
     </w:p>
     <w:p>
       <w:pPr>
-        <w:pStyle w:val="ListBullet"/>
+        <w:keepNext/>
+        <w:spacing w:before="0" w:after="40" w:line="276" w:lineRule="auto"/>
+        <w:ind w:left="0" w:firstLine="0"/>
       </w:pPr>
       <w:r>
-        <w:t>Collaborated with IT department to troubleshoot technical issues with office equipment and software.</w:t>
-      </w:r>
-    </w:p>
-    <w:p>
-      <w:r>
         <w:rPr>
+          <w:rFonts w:ascii="Arial" w:hAnsi="Arial"/>
           <w:b/>
+          <w:color w:val="374151"/>
+          <w:sz w:val="18"/>
         </w:rPr>
-        <w:t>Clearcase/Clearquest Administrator/Build Engineer | Salira | CA</w:t>
-        <w:br/>
-      </w:r>
-      <w:r>
-        <w:rPr>
-          <w:i/>
-        </w:rPr>
-        <w:t>August 2001 - February 2004</w:t>
+        <w:t>Cpanel/WebPros | CA</w:t>
       </w:r>
     </w:p>
     <w:p>
       <w:pPr>
-        <w:pStyle w:val="ListBullet"/>
+        <w:tabs>
+          <w:tab w:pos="400" w:val="left"/>
+        </w:tabs>
+        <w:spacing w:before="0" w:after="44" w:line="276" w:lineRule="auto"/>
+        <w:ind w:left="400" w:hanging="200"/>
       </w:pPr>
       <w:r>
-        <w:t>Joined Salira Optical Network Systems as a Clearcase/Clearquest Administrator.</w:t>
+        <w:rPr>
+          <w:rFonts w:ascii="Arial" w:hAnsi="Arial"/>
+          <w:color w:val="6B7280"/>
+          <w:sz w:val="17"/>
+        </w:rPr>
+        <w:t>•</w:t>
+        <w:tab/>
+      </w:r>
+      <w:r>
+        <w:rPr>
+          <w:rFonts w:ascii="Arial" w:hAnsi="Arial"/>
+          <w:color w:val="1F2937"/>
+          <w:sz w:val="17"/>
+        </w:rPr>
+        <w:t>Worked on the Artemis Team, improving WHM and learning Cpanel's extensive code base</w:t>
       </w:r>
     </w:p>
     <w:p>
       <w:pPr>
-        <w:pStyle w:val="ListBullet"/>
+        <w:tabs>
+          <w:tab w:pos="400" w:val="left"/>
+        </w:tabs>
+        <w:spacing w:before="0" w:after="44" w:line="276" w:lineRule="auto"/>
+        <w:ind w:left="400" w:hanging="200"/>
       </w:pPr>
       <w:r>
-        <w:t>Set up environment, provided training, and managed the build process as Release Engineer.</w:t>
+        <w:rPr>
+          <w:rFonts w:ascii="Arial" w:hAnsi="Arial"/>
+          <w:color w:val="6B7280"/>
+          <w:sz w:val="17"/>
+        </w:rPr>
+        <w:t>•</w:t>
+        <w:tab/>
+      </w:r>
+      <w:r>
+        <w:rPr>
+          <w:rFonts w:ascii="Arial" w:hAnsi="Arial"/>
+          <w:color w:val="1F2937"/>
+          <w:sz w:val="17"/>
+        </w:rPr>
+        <w:t>Transitioned to the Release Team, focusing on bug fixes and release tasks</w:t>
       </w:r>
     </w:p>
     <w:p>
       <w:pPr>
-        <w:pStyle w:val="ListBullet"/>
+        <w:tabs>
+          <w:tab w:pos="400" w:val="left"/>
+        </w:tabs>
+        <w:spacing w:before="0" w:after="44" w:line="276" w:lineRule="auto"/>
+        <w:ind w:left="400" w:hanging="200"/>
       </w:pPr>
       <w:r>
-        <w:t>Developed Clearquest Daemon, automation scripts, and conducted Build Stress Testing.</w:t>
+        <w:rPr>
+          <w:rFonts w:ascii="Arial" w:hAnsi="Arial"/>
+          <w:color w:val="6B7280"/>
+          <w:sz w:val="17"/>
+        </w:rPr>
+        <w:t>•</w:t>
+        <w:tab/>
+      </w:r>
+      <w:r>
+        <w:rPr>
+          <w:rFonts w:ascii="Arial" w:hAnsi="Arial"/>
+          <w:color w:val="1F2937"/>
+          <w:sz w:val="17"/>
+        </w:rPr>
+        <w:t>Contributed to the WordPress Squared team, enhancing backend functionality with bug fixes and improvements</w:t>
       </w:r>
     </w:p>
     <w:p>
       <w:pPr>
-        <w:pStyle w:val="ListBullet"/>
+        <w:tabs>
+          <w:tab w:pos="400" w:val="left"/>
+        </w:tabs>
+        <w:spacing w:before="0" w:after="44" w:line="276" w:lineRule="auto"/>
+        <w:ind w:left="400" w:hanging="200"/>
       </w:pPr>
       <w:r>
-        <w:t>Designed and implemented Clearquest bug tracking system.</w:t>
+        <w:rPr>
+          <w:rFonts w:ascii="Arial" w:hAnsi="Arial"/>
+          <w:color w:val="6B7280"/>
+          <w:sz w:val="17"/>
+        </w:rPr>
+        <w:t>•</w:t>
+        <w:tab/>
+      </w:r>
+      <w:r>
+        <w:rPr>
+          <w:rFonts w:ascii="Arial" w:hAnsi="Arial"/>
+          <w:color w:val="1F2937"/>
+          <w:sz w:val="17"/>
+        </w:rPr>
+        <w:t>Conducted quality assurance and integration testing for project readiness</w:t>
       </w:r>
     </w:p>
     <w:p>
       <w:pPr>
-        <w:pStyle w:val="ListBullet"/>
+        <w:tabs>
+          <w:tab w:pos="400" w:val="left"/>
+        </w:tabs>
+        <w:spacing w:before="0" w:after="44" w:line="276" w:lineRule="auto"/>
+        <w:ind w:left="400" w:hanging="200"/>
       </w:pPr>
       <w:r>
-        <w:t>Advised on Clearcase issues, branching strategies, labeling, and release management.</w:t>
-      </w:r>
-    </w:p>
-    <w:p>
-      <w:r>
         <w:rPr>
-          <w:b/>
+          <w:rFonts w:ascii="Arial" w:hAnsi="Arial"/>
+          <w:color w:val="6B7280"/>
+          <w:sz w:val="17"/>
         </w:rPr>
-        <w:t>Clearcase/Unix Systems Administrator | Hewlett Packard Company | CA</w:t>
-        <w:br/>
+        <w:t>•</w:t>
+        <w:tab/>
       </w:r>
       <w:r>
         <w:rPr>
-          <w:i/>
+          <w:rFonts w:ascii="Arial" w:hAnsi="Arial"/>
+          <w:color w:val="1F2937"/>
+          <w:sz w:val="17"/>
         </w:rPr>
-        <w:t>February 1998 - August 2001</w:t>
+        <w:t>Developed software applications to enhance client satisfaction and user experience</w:t>
       </w:r>
     </w:p>
     <w:p>
       <w:pPr>
-        <w:pStyle w:val="ListBullet"/>
+        <w:keepNext/>
+        <w:spacing w:before="140" w:after="20" w:line="276" w:lineRule="auto"/>
+        <w:ind w:left="0" w:firstLine="0"/>
       </w:pPr>
       <w:r>
-        <w:t>Primary Clearcase and Multisite Administrator for a large environment with 1400 views and 180 vobs.</w:t>
+        <w:rPr>
+          <w:rFonts w:ascii="Arial" w:hAnsi="Arial"/>
+          <w:b/>
+          <w:color w:val="DC2626"/>
+          <w:sz w:val="19"/>
+        </w:rPr>
+        <w:t>Engineer Consultant | July 2007 - September 2021</w:t>
       </w:r>
     </w:p>
     <w:p>
       <w:pPr>
-        <w:pStyle w:val="ListBullet"/>
+        <w:keepNext/>
+        <w:spacing w:before="0" w:after="40" w:line="276" w:lineRule="auto"/>
+        <w:ind w:left="0" w:firstLine="0"/>
       </w:pPr>
       <w:r>
-        <w:t>Assisted in network and Clearcase topology design, setup, and maintenance.</w:t>
+        <w:rPr>
+          <w:rFonts w:ascii="Arial" w:hAnsi="Arial"/>
+          <w:b/>
+          <w:color w:val="374151"/>
+          <w:sz w:val="18"/>
+        </w:rPr>
+        <w:t>ClearSCM, Inc | CA</w:t>
       </w:r>
     </w:p>
     <w:p>
       <w:pPr>
-        <w:pStyle w:val="ListBullet"/>
+        <w:tabs>
+          <w:tab w:pos="400" w:val="left"/>
+        </w:tabs>
+        <w:spacing w:before="0" w:after="44" w:line="276" w:lineRule="auto"/>
+        <w:ind w:left="400" w:hanging="200"/>
       </w:pPr>
       <w:r>
-        <w:t>Managed Netscape Suitespot Servers for 400 machines, developed lab web pages, and restructured network topology.</w:t>
+        <w:rPr>
+          <w:rFonts w:ascii="Arial" w:hAnsi="Arial"/>
+          <w:color w:val="6B7280"/>
+          <w:sz w:val="17"/>
+        </w:rPr>
+        <w:t>•</w:t>
+        <w:tab/>
+      </w:r>
+      <w:r>
+        <w:rPr>
+          <w:rFonts w:ascii="Arial" w:hAnsi="Arial"/>
+          <w:color w:val="1F2937"/>
+          <w:sz w:val="17"/>
+        </w:rPr>
+        <w:t>Ran a consulting firm specializing in Build Engineering, Linux Administration and Version Control Systems</w:t>
       </w:r>
     </w:p>
     <w:p>
       <w:pPr>
-        <w:pStyle w:val="ListBullet"/>
+        <w:tabs>
+          <w:tab w:pos="400" w:val="left"/>
+        </w:tabs>
+        <w:spacing w:before="0" w:after="44" w:line="276" w:lineRule="auto"/>
+        <w:ind w:left="400" w:hanging="200"/>
       </w:pPr>
       <w:r>
-        <w:t>Managed Windows NT domain, account setup, print serving, and evaluated Clearcase 3.2 on NT.</w:t>
+        <w:rPr>
+          <w:rFonts w:ascii="Arial" w:hAnsi="Arial"/>
+          <w:color w:val="6B7280"/>
+          <w:sz w:val="17"/>
+        </w:rPr>
+        <w:t>•</w:t>
+        <w:tab/>
+      </w:r>
+      <w:r>
+        <w:rPr>
+          <w:rFonts w:ascii="Arial" w:hAnsi="Arial"/>
+          <w:color w:val="1F2937"/>
+          <w:sz w:val="17"/>
+        </w:rPr>
+        <w:t>Provided services to many clients like Wells Fargo, General Dynamics, Broadcom, ICANN, and General Electric</w:t>
       </w:r>
     </w:p>
     <w:p>
       <w:pPr>
-        <w:pStyle w:val="Heading1"/>
+        <w:tabs>
+          <w:tab w:pos="400" w:val="left"/>
+        </w:tabs>
+        <w:spacing w:before="0" w:after="44" w:line="276" w:lineRule="auto"/>
+        <w:ind w:left="400" w:hanging="200"/>
       </w:pPr>
       <w:r>
-        <w:t>Education</w:t>
+        <w:rPr>
+          <w:rFonts w:ascii="Arial" w:hAnsi="Arial"/>
+          <w:color w:val="6B7280"/>
+          <w:sz w:val="17"/>
+        </w:rPr>
+        <w:t>•</w:t>
+        <w:tab/>
+      </w:r>
+      <w:r>
+        <w:rPr>
+          <w:rFonts w:ascii="Arial" w:hAnsi="Arial"/>
+          <w:color w:val="1F2937"/>
+          <w:sz w:val="17"/>
+        </w:rPr>
+        <w:t>Served as a Perl developer writing scripts automating tasks in build systems, test systems, and complete applications</w:t>
       </w:r>
     </w:p>
     <w:p>
+      <w:pPr>
+        <w:tabs>
+          <w:tab w:pos="400" w:val="left"/>
+        </w:tabs>
+        <w:spacing w:before="0" w:after="44" w:line="276" w:lineRule="auto"/>
+        <w:ind w:left="400" w:hanging="200"/>
+      </w:pPr>
       <w:r>
+        <w:rPr>
+          <w:rFonts w:ascii="Arial" w:hAnsi="Arial"/>
+          <w:color w:val="6B7280"/>
+          <w:sz w:val="17"/>
+        </w:rPr>
+        <w:t>•</w:t>
+        <w:tab/>
+      </w:r>
+      <w:r>
+        <w:rPr>
+          <w:rFonts w:ascii="Arial" w:hAnsi="Arial"/>
+          <w:color w:val="1F2937"/>
+          <w:sz w:val="17"/>
+        </w:rPr>
+        <w:t>Administered subsystems like Puppet/Ansible, Clearcase/Clearquest, Git, Perforce, Jenkins, and JIRA</w:t>
+      </w:r>
+    </w:p>
+    <w:p>
+      <w:pPr>
+        <w:tabs>
+          <w:tab w:pos="400" w:val="left"/>
+        </w:tabs>
+        <w:spacing w:before="0" w:after="44" w:line="276" w:lineRule="auto"/>
+        <w:ind w:left="400" w:hanging="200"/>
+      </w:pPr>
+      <w:r>
+        <w:rPr>
+          <w:rFonts w:ascii="Arial" w:hAnsi="Arial"/>
+          <w:color w:val="6B7280"/>
+          <w:sz w:val="17"/>
+        </w:rPr>
+        <w:t>•</w:t>
+        <w:tab/>
+      </w:r>
+      <w:r>
+        <w:rPr>
+          <w:rFonts w:ascii="Arial" w:hAnsi="Arial"/>
+          <w:color w:val="1F2937"/>
+          <w:sz w:val="17"/>
+        </w:rPr>
+        <w:t>Specialized in Linux administration</w:t>
+      </w:r>
+    </w:p>
+    <w:p>
+      <w:pPr>
+        <w:keepNext/>
+        <w:spacing w:before="140" w:after="20" w:line="276" w:lineRule="auto"/>
+        <w:ind w:left="0" w:firstLine="0"/>
+      </w:pPr>
+      <w:r>
+        <w:rPr>
+          <w:rFonts w:ascii="Arial" w:hAnsi="Arial"/>
+          <w:b/>
+          <w:color w:val="DC2626"/>
+          <w:sz w:val="19"/>
+        </w:rPr>
+        <w:t>Clearcase/Clearquest Administrator | February 2004 - June 2007</w:t>
+      </w:r>
+    </w:p>
+    <w:p>
+      <w:pPr>
+        <w:keepNext/>
+        <w:spacing w:before="0" w:after="40" w:line="276" w:lineRule="auto"/>
+        <w:ind w:left="0" w:firstLine="0"/>
+      </w:pPr>
+      <w:r>
+        <w:rPr>
+          <w:rFonts w:ascii="Arial" w:hAnsi="Arial"/>
+          <w:b/>
+          <w:color w:val="374151"/>
+          <w:sz w:val="18"/>
+        </w:rPr>
+        <w:t>DeFaria.com | CA</w:t>
+      </w:r>
+    </w:p>
+    <w:p>
+      <w:pPr>
+        <w:tabs>
+          <w:tab w:pos="400" w:val="left"/>
+        </w:tabs>
+        <w:spacing w:before="0" w:after="44" w:line="276" w:lineRule="auto"/>
+        <w:ind w:left="400" w:hanging="200"/>
+      </w:pPr>
+      <w:r>
+        <w:rPr>
+          <w:rFonts w:ascii="Arial" w:hAnsi="Arial"/>
+          <w:color w:val="6B7280"/>
+          <w:sz w:val="17"/>
+        </w:rPr>
+        <w:t>•</w:t>
+        <w:tab/>
+      </w:r>
+      <w:r>
+        <w:rPr>
+          <w:rFonts w:ascii="Arial" w:hAnsi="Arial"/>
+          <w:color w:val="1F2937"/>
+          <w:sz w:val="17"/>
+        </w:rPr>
+        <w:t>Consulted for clients including Hewlett Packard, Broadcom, Lynuxworks, and Ameriquest</w:t>
+      </w:r>
+    </w:p>
+    <w:p>
+      <w:pPr>
+        <w:tabs>
+          <w:tab w:pos="400" w:val="left"/>
+        </w:tabs>
+        <w:spacing w:before="0" w:after="44" w:line="276" w:lineRule="auto"/>
+        <w:ind w:left="400" w:hanging="200"/>
+      </w:pPr>
+      <w:r>
+        <w:rPr>
+          <w:rFonts w:ascii="Arial" w:hAnsi="Arial"/>
+          <w:color w:val="6B7280"/>
+          <w:sz w:val="17"/>
+        </w:rPr>
+        <w:t>•</w:t>
+        <w:tab/>
+      </w:r>
+      <w:r>
+        <w:rPr>
+          <w:rFonts w:ascii="Arial" w:hAnsi="Arial"/>
+          <w:color w:val="1F2937"/>
+          <w:sz w:val="17"/>
+        </w:rPr>
+        <w:t>Specialized in Build Release engineering, Clearcase/Clearquest engineering, and system security hardening</w:t>
+      </w:r>
+    </w:p>
+    <w:p>
+      <w:pPr>
+        <w:tabs>
+          <w:tab w:pos="400" w:val="left"/>
+        </w:tabs>
+        <w:spacing w:before="0" w:after="44" w:line="276" w:lineRule="auto"/>
+        <w:ind w:left="400" w:hanging="200"/>
+      </w:pPr>
+      <w:r>
+        <w:rPr>
+          <w:rFonts w:ascii="Arial" w:hAnsi="Arial"/>
+          <w:color w:val="6B7280"/>
+          <w:sz w:val="17"/>
+        </w:rPr>
+        <w:t>•</w:t>
+        <w:tab/>
+      </w:r>
+      <w:r>
+        <w:rPr>
+          <w:rFonts w:ascii="Arial" w:hAnsi="Arial"/>
+          <w:color w:val="1F2937"/>
+          <w:sz w:val="17"/>
+        </w:rPr>
+        <w:t>Addressed customer inquiries and resolved issues promptly</w:t>
+      </w:r>
+    </w:p>
+    <w:p>
+      <w:pPr>
+        <w:tabs>
+          <w:tab w:pos="400" w:val="left"/>
+        </w:tabs>
+        <w:spacing w:before="0" w:after="44" w:line="276" w:lineRule="auto"/>
+        <w:ind w:left="400" w:hanging="200"/>
+      </w:pPr>
+      <w:r>
+        <w:rPr>
+          <w:rFonts w:ascii="Arial" w:hAnsi="Arial"/>
+          <w:color w:val="6B7280"/>
+          <w:sz w:val="17"/>
+        </w:rPr>
+        <w:t>•</w:t>
+        <w:tab/>
+      </w:r>
+      <w:r>
+        <w:rPr>
+          <w:rFonts w:ascii="Arial" w:hAnsi="Arial"/>
+          <w:color w:val="1F2937"/>
+          <w:sz w:val="17"/>
+        </w:rPr>
+        <w:t>Collaborated with IT department to troubleshoot technical issues with office equipment and software</w:t>
+      </w:r>
+    </w:p>
+    <w:p>
+      <w:pPr>
+        <w:keepNext/>
+        <w:spacing w:before="140" w:after="20" w:line="276" w:lineRule="auto"/>
+        <w:ind w:left="0" w:firstLine="0"/>
+      </w:pPr>
+      <w:r>
+        <w:rPr>
+          <w:rFonts w:ascii="Arial" w:hAnsi="Arial"/>
+          <w:b/>
+          <w:color w:val="DC2626"/>
+          <w:sz w:val="19"/>
+        </w:rPr>
+        <w:t>Clearcase/Clearquest Administrator/Build Engineer | August 2001 - February 2004</w:t>
+      </w:r>
+    </w:p>
+    <w:p>
+      <w:pPr>
+        <w:keepNext/>
+        <w:spacing w:before="0" w:after="40" w:line="276" w:lineRule="auto"/>
+        <w:ind w:left="0" w:firstLine="0"/>
+      </w:pPr>
+      <w:r>
+        <w:rPr>
+          <w:rFonts w:ascii="Arial" w:hAnsi="Arial"/>
+          <w:b/>
+          <w:color w:val="374151"/>
+          <w:sz w:val="18"/>
+        </w:rPr>
+        <w:t>Salira | CA</w:t>
+      </w:r>
+    </w:p>
+    <w:p>
+      <w:pPr>
+        <w:tabs>
+          <w:tab w:pos="400" w:val="left"/>
+        </w:tabs>
+        <w:spacing w:before="0" w:after="44" w:line="276" w:lineRule="auto"/>
+        <w:ind w:left="400" w:hanging="200"/>
+      </w:pPr>
+      <w:r>
+        <w:rPr>
+          <w:rFonts w:ascii="Arial" w:hAnsi="Arial"/>
+          <w:color w:val="6B7280"/>
+          <w:sz w:val="17"/>
+        </w:rPr>
+        <w:t>•</w:t>
+        <w:tab/>
+      </w:r>
+      <w:r>
+        <w:rPr>
+          <w:rFonts w:ascii="Arial" w:hAnsi="Arial"/>
+          <w:color w:val="1F2937"/>
+          <w:sz w:val="17"/>
+        </w:rPr>
+        <w:t>Joined Salira Optical Network Systems as a Clearcase/Clearquest Administrator</w:t>
+      </w:r>
+    </w:p>
+    <w:p>
+      <w:pPr>
+        <w:tabs>
+          <w:tab w:pos="400" w:val="left"/>
+        </w:tabs>
+        <w:spacing w:before="0" w:after="44" w:line="276" w:lineRule="auto"/>
+        <w:ind w:left="400" w:hanging="200"/>
+      </w:pPr>
+      <w:r>
+        <w:rPr>
+          <w:rFonts w:ascii="Arial" w:hAnsi="Arial"/>
+          <w:color w:val="6B7280"/>
+          <w:sz w:val="17"/>
+        </w:rPr>
+        <w:t>•</w:t>
+        <w:tab/>
+      </w:r>
+      <w:r>
+        <w:rPr>
+          <w:rFonts w:ascii="Arial" w:hAnsi="Arial"/>
+          <w:color w:val="1F2937"/>
+          <w:sz w:val="17"/>
+        </w:rPr>
+        <w:t>Set up environment, provided training, and managed the build process as Release Engineer</w:t>
+      </w:r>
+    </w:p>
+    <w:p>
+      <w:pPr>
+        <w:tabs>
+          <w:tab w:pos="400" w:val="left"/>
+        </w:tabs>
+        <w:spacing w:before="0" w:after="44" w:line="276" w:lineRule="auto"/>
+        <w:ind w:left="400" w:hanging="200"/>
+      </w:pPr>
+      <w:r>
+        <w:rPr>
+          <w:rFonts w:ascii="Arial" w:hAnsi="Arial"/>
+          <w:color w:val="6B7280"/>
+          <w:sz w:val="17"/>
+        </w:rPr>
+        <w:t>•</w:t>
+        <w:tab/>
+      </w:r>
+      <w:r>
+        <w:rPr>
+          <w:rFonts w:ascii="Arial" w:hAnsi="Arial"/>
+          <w:color w:val="1F2937"/>
+          <w:sz w:val="17"/>
+        </w:rPr>
+        <w:t>Developed Clearquest Daemon, automation scripts, and conducted Build Stress Testing</w:t>
+      </w:r>
+    </w:p>
+    <w:p>
+      <w:pPr>
+        <w:tabs>
+          <w:tab w:pos="400" w:val="left"/>
+        </w:tabs>
+        <w:spacing w:before="0" w:after="44" w:line="276" w:lineRule="auto"/>
+        <w:ind w:left="400" w:hanging="200"/>
+      </w:pPr>
+      <w:r>
+        <w:rPr>
+          <w:rFonts w:ascii="Arial" w:hAnsi="Arial"/>
+          <w:color w:val="6B7280"/>
+          <w:sz w:val="17"/>
+        </w:rPr>
+        <w:t>•</w:t>
+        <w:tab/>
+      </w:r>
+      <w:r>
+        <w:rPr>
+          <w:rFonts w:ascii="Arial" w:hAnsi="Arial"/>
+          <w:color w:val="1F2937"/>
+          <w:sz w:val="17"/>
+        </w:rPr>
+        <w:t>Designed and implemented Clearquest bug tracking system</w:t>
+      </w:r>
+    </w:p>
+    <w:p>
+      <w:pPr>
+        <w:tabs>
+          <w:tab w:pos="400" w:val="left"/>
+        </w:tabs>
+        <w:spacing w:before="0" w:after="44" w:line="276" w:lineRule="auto"/>
+        <w:ind w:left="400" w:hanging="200"/>
+      </w:pPr>
+      <w:r>
+        <w:rPr>
+          <w:rFonts w:ascii="Arial" w:hAnsi="Arial"/>
+          <w:color w:val="6B7280"/>
+          <w:sz w:val="17"/>
+        </w:rPr>
+        <w:t>•</w:t>
+        <w:tab/>
+      </w:r>
+      <w:r>
+        <w:rPr>
+          <w:rFonts w:ascii="Arial" w:hAnsi="Arial"/>
+          <w:color w:val="1F2937"/>
+          <w:sz w:val="17"/>
+        </w:rPr>
+        <w:t>Advised on Clearcase issues, branching strategies, labeling, and release management</w:t>
+      </w:r>
+    </w:p>
+    <w:p>
+      <w:pPr>
+        <w:tabs>
+          <w:tab w:pos="400" w:val="left"/>
+        </w:tabs>
+        <w:spacing w:before="0" w:after="44" w:line="276" w:lineRule="auto"/>
+        <w:ind w:left="400" w:hanging="200"/>
+      </w:pPr>
+      <w:r>
+        <w:rPr>
+          <w:rFonts w:ascii="Arial" w:hAnsi="Arial"/>
+          <w:color w:val="6B7280"/>
+          <w:sz w:val="17"/>
+        </w:rPr>
+        <w:t>•</w:t>
+        <w:tab/>
+      </w:r>
+      <w:r>
+        <w:rPr>
+          <w:rFonts w:ascii="Arial" w:hAnsi="Arial"/>
+          <w:color w:val="1F2937"/>
+          <w:sz w:val="17"/>
+        </w:rPr>
+        <w:t>Implemented Clearquest Daemon for web page and trigger interactions</w:t>
+      </w:r>
+    </w:p>
+    <w:p>
+      <w:pPr>
+        <w:keepNext/>
+        <w:spacing w:before="140" w:after="20" w:line="276" w:lineRule="auto"/>
+        <w:ind w:left="0" w:firstLine="0"/>
+      </w:pPr>
+      <w:r>
+        <w:rPr>
+          <w:rFonts w:ascii="Arial" w:hAnsi="Arial"/>
+          <w:b/>
+          <w:color w:val="DC2626"/>
+          <w:sz w:val="19"/>
+        </w:rPr>
+        <w:t>Clearcase/Unix Systems Administrator | February 1998 - August 2001</w:t>
+      </w:r>
+    </w:p>
+    <w:p>
+      <w:pPr>
+        <w:keepNext/>
+        <w:spacing w:before="0" w:after="40" w:line="276" w:lineRule="auto"/>
+        <w:ind w:left="0" w:firstLine="0"/>
+      </w:pPr>
+      <w:r>
+        <w:rPr>
+          <w:rFonts w:ascii="Arial" w:hAnsi="Arial"/>
+          <w:b/>
+          <w:color w:val="374151"/>
+          <w:sz w:val="18"/>
+        </w:rPr>
+        <w:t>Hewlett Packard Company | CA</w:t>
+      </w:r>
+    </w:p>
+    <w:p>
+      <w:pPr>
+        <w:tabs>
+          <w:tab w:pos="400" w:val="left"/>
+        </w:tabs>
+        <w:spacing w:before="0" w:after="44" w:line="276" w:lineRule="auto"/>
+        <w:ind w:left="400" w:hanging="200"/>
+      </w:pPr>
+      <w:r>
+        <w:rPr>
+          <w:rFonts w:ascii="Arial" w:hAnsi="Arial"/>
+          <w:color w:val="6B7280"/>
+          <w:sz w:val="17"/>
+        </w:rPr>
+        <w:t>•</w:t>
+        <w:tab/>
+      </w:r>
+      <w:r>
+        <w:rPr>
+          <w:rFonts w:ascii="Arial" w:hAnsi="Arial"/>
+          <w:color w:val="1F2937"/>
+          <w:sz w:val="17"/>
+        </w:rPr>
+        <w:t>Primary Clearcase and Multisite Administrator for a large environment with 1400 views and 180 vobs</w:t>
+      </w:r>
+    </w:p>
+    <w:p>
+      <w:pPr>
+        <w:tabs>
+          <w:tab w:pos="400" w:val="left"/>
+        </w:tabs>
+        <w:spacing w:before="0" w:after="44" w:line="276" w:lineRule="auto"/>
+        <w:ind w:left="400" w:hanging="200"/>
+      </w:pPr>
+      <w:r>
+        <w:rPr>
+          <w:rFonts w:ascii="Arial" w:hAnsi="Arial"/>
+          <w:color w:val="6B7280"/>
+          <w:sz w:val="17"/>
+        </w:rPr>
+        <w:t>•</w:t>
+        <w:tab/>
+      </w:r>
+      <w:r>
+        <w:rPr>
+          <w:rFonts w:ascii="Arial" w:hAnsi="Arial"/>
+          <w:color w:val="1F2937"/>
+          <w:sz w:val="17"/>
+        </w:rPr>
+        <w:t>Assisted in network and Clearcase topology design, setup, and maintenance</w:t>
+      </w:r>
+    </w:p>
+    <w:p>
+      <w:pPr>
+        <w:tabs>
+          <w:tab w:pos="400" w:val="left"/>
+        </w:tabs>
+        <w:spacing w:before="0" w:after="44" w:line="276" w:lineRule="auto"/>
+        <w:ind w:left="400" w:hanging="200"/>
+      </w:pPr>
+      <w:r>
+        <w:rPr>
+          <w:rFonts w:ascii="Arial" w:hAnsi="Arial"/>
+          <w:color w:val="6B7280"/>
+          <w:sz w:val="17"/>
+        </w:rPr>
+        <w:t>•</w:t>
+        <w:tab/>
+      </w:r>
+      <w:r>
+        <w:rPr>
+          <w:rFonts w:ascii="Arial" w:hAnsi="Arial"/>
+          <w:color w:val="1F2937"/>
+          <w:sz w:val="17"/>
+        </w:rPr>
+        <w:t>Managed Netscape Suitespot Servers for 400 machines, developed lab web pages, and restructured network topology. Documented setups, troubleshooting, and patch handling for shared resources</w:t>
+      </w:r>
+    </w:p>
+    <w:p>
+      <w:pPr>
+        <w:tabs>
+          <w:tab w:pos="400" w:val="left"/>
+        </w:tabs>
+        <w:spacing w:before="0" w:after="44" w:line="276" w:lineRule="auto"/>
+        <w:ind w:left="400" w:hanging="200"/>
+      </w:pPr>
+      <w:r>
+        <w:rPr>
+          <w:rFonts w:ascii="Arial" w:hAnsi="Arial"/>
+          <w:color w:val="6B7280"/>
+          <w:sz w:val="17"/>
+        </w:rPr>
+        <w:t>•</w:t>
+        <w:tab/>
+      </w:r>
+      <w:r>
+        <w:rPr>
+          <w:rFonts w:ascii="Arial" w:hAnsi="Arial"/>
+          <w:color w:val="1F2937"/>
+          <w:sz w:val="17"/>
+        </w:rPr>
+        <w:t>Managed Windows NT domain, account setup, print serving, and evaluated Clearcase 3.2 on NT</w:t>
+      </w:r>
+    </w:p>
+    <w:p>
+      <w:pPr>
+        <w:tabs>
+          <w:tab w:pos="400" w:val="left"/>
+        </w:tabs>
+        <w:spacing w:before="0" w:after="44" w:line="276" w:lineRule="auto"/>
+        <w:ind w:left="400" w:hanging="200"/>
+      </w:pPr>
+      <w:r>
+        <w:rPr>
+          <w:rFonts w:ascii="Arial" w:hAnsi="Arial"/>
+          <w:color w:val="6B7280"/>
+          <w:sz w:val="17"/>
+        </w:rPr>
+        <w:t>•</w:t>
+        <w:tab/>
+      </w:r>
+      <w:r>
+        <w:rPr>
+          <w:rFonts w:ascii="Arial" w:hAnsi="Arial"/>
+          <w:color w:val="1F2937"/>
+          <w:sz w:val="17"/>
+        </w:rPr>
+        <w:t>Developed NT backup strategy and maintained software tool repository</w:t>
+      </w:r>
+    </w:p>
+    <w:p>
+      <w:pPr>
+        <w:tabs>
+          <w:tab w:pos="400" w:val="left"/>
+        </w:tabs>
+        <w:spacing w:before="0" w:after="44" w:line="276" w:lineRule="auto"/>
+        <w:ind w:left="400" w:hanging="200"/>
+      </w:pPr>
+      <w:r>
+        <w:rPr>
+          <w:rFonts w:ascii="Arial" w:hAnsi="Arial"/>
+          <w:color w:val="6B7280"/>
+          <w:sz w:val="17"/>
+        </w:rPr>
+        <w:t>•</w:t>
+        <w:tab/>
+      </w:r>
+      <w:r>
+        <w:rPr>
+          <w:rFonts w:ascii="Arial" w:hAnsi="Arial"/>
+          <w:color w:val="1F2937"/>
+          <w:sz w:val="17"/>
+        </w:rPr>
+        <w:t>Main contact for Windows 95/NT problem-solving; consulted on PC and Unix issues</w:t>
+      </w:r>
+    </w:p>
+    <w:p>
+      <w:pPr>
+        <w:tabs>
+          <w:tab w:pos="400" w:val="left"/>
+        </w:tabs>
+        <w:spacing w:before="0" w:after="44" w:line="276" w:lineRule="auto"/>
+        <w:ind w:left="400" w:hanging="200"/>
+      </w:pPr>
+      <w:r>
+        <w:rPr>
+          <w:rFonts w:ascii="Arial" w:hAnsi="Arial"/>
+          <w:color w:val="6B7280"/>
+          <w:sz w:val="17"/>
+        </w:rPr>
+        <w:t>•</w:t>
+        <w:tab/>
+      </w:r>
+      <w:r>
+        <w:rPr>
+          <w:rFonts w:ascii="Arial" w:hAnsi="Arial"/>
+          <w:color w:val="1F2937"/>
+          <w:sz w:val="17"/>
+        </w:rPr>
+        <w:t>Served as lab webmaster, installed, configured, and maintained Netscape Servers, and ran The Unofficial Quicken Web Page</w:t>
+      </w:r>
+    </w:p>
+    <w:p>
+      <w:pPr>
+        <w:tabs>
+          <w:tab w:pos="400" w:val="left"/>
+        </w:tabs>
+        <w:spacing w:before="0" w:after="44" w:line="276" w:lineRule="auto"/>
+        <w:ind w:left="400" w:hanging="200"/>
+      </w:pPr>
+      <w:r>
+        <w:rPr>
+          <w:rFonts w:ascii="Arial" w:hAnsi="Arial"/>
+          <w:color w:val="6B7280"/>
+          <w:sz w:val="17"/>
+        </w:rPr>
+        <w:t>•</w:t>
+        <w:tab/>
+      </w:r>
+      <w:r>
+        <w:rPr>
+          <w:rFonts w:ascii="Arial" w:hAnsi="Arial"/>
+          <w:color w:val="1F2937"/>
+          <w:sz w:val="17"/>
+        </w:rPr>
+        <w:t>Developed an Application Server for software distribution using scripting and NFS</w:t>
+      </w:r>
+    </w:p>
+    <w:p>
+      <w:pPr>
+        <w:tabs>
+          <w:tab w:pos="400" w:val="left"/>
+        </w:tabs>
+        <w:spacing w:before="0" w:after="44" w:line="276" w:lineRule="auto"/>
+        <w:ind w:left="400" w:hanging="200"/>
+      </w:pPr>
+      <w:r>
+        <w:rPr>
+          <w:rFonts w:ascii="Arial" w:hAnsi="Arial"/>
+          <w:color w:val="6B7280"/>
+          <w:sz w:val="17"/>
+        </w:rPr>
+        <w:t>•</w:t>
+        <w:tab/>
+      </w:r>
+      <w:r>
+        <w:rPr>
+          <w:rFonts w:ascii="Arial" w:hAnsi="Arial"/>
+          <w:color w:val="1F2937"/>
+          <w:sz w:val="17"/>
+        </w:rPr>
+        <w:t>Worked on COBOL/SoftBench and Ada/SoftBench projects, porting applications and producing Ada bindings to Xlib, Xt, Motif, and HP-UX</w:t>
+      </w:r>
+    </w:p>
+    <w:p>
+      <w:pPr>
+        <w:tabs>
+          <w:tab w:pos="400" w:val="left"/>
+        </w:tabs>
+        <w:spacing w:before="0" w:after="44" w:line="276" w:lineRule="auto"/>
+        <w:ind w:left="400" w:hanging="200"/>
+      </w:pPr>
+      <w:r>
+        <w:rPr>
+          <w:rFonts w:ascii="Arial" w:hAnsi="Arial"/>
+          <w:color w:val="6B7280"/>
+          <w:sz w:val="17"/>
+        </w:rPr>
+        <w:t>•</w:t>
+        <w:tab/>
+      </w:r>
+      <w:r>
+        <w:rPr>
+          <w:rFonts w:ascii="Arial" w:hAnsi="Arial"/>
+          <w:color w:val="1F2937"/>
+          <w:sz w:val="17"/>
+        </w:rPr>
+        <w:t>Conducted destructive testing on MPE/XL, submitting 300+ Service Requests, many on Must Fix lists</w:t>
+      </w:r>
+    </w:p>
+    <w:p>
+      <w:pPr>
+        <w:keepNext/>
+        <w:spacing w:before="200" w:after="80"/>
+      </w:pPr>
+      <w:r>
+        <w:rPr>
+          <w:rFonts w:ascii="Arial" w:hAnsi="Arial"/>
+          <w:b/>
+          <w:color w:val="3B82F6"/>
+          <w:sz w:val="23"/>
+        </w:rPr>
+        <w:t>EDUCATION</w:t>
+      </w:r>
+    </w:p>
+    <w:p>
+      <w:pPr>
+        <w:keepNext/>
+        <w:spacing w:before="140" w:after="20" w:line="276" w:lineRule="auto"/>
+        <w:ind w:left="0" w:firstLine="0"/>
+      </w:pPr>
+      <w:r>
+        <w:rPr>
+          <w:rFonts w:ascii="Arial" w:hAnsi="Arial"/>
+          <w:b/>
+          <w:color w:val="DC2626"/>
+          <w:sz w:val="19"/>
+        </w:rPr>
         <w:t>Associate in Applied Science (A.A.S) - Computer Science</w:t>
-        <w:br/>
+      </w:r>
+    </w:p>
+    <w:p>
+      <w:pPr>
+        <w:spacing w:before="0" w:after="80" w:line="276" w:lineRule="auto"/>
+        <w:ind w:left="0" w:firstLine="0"/>
+      </w:pPr>
+      <w:r>
+        <w:rPr>
+          <w:rFonts w:ascii="Arial" w:hAnsi="Arial"/>
+          <w:color w:val="1F2937"/>
+          <w:sz w:val="19"/>
+        </w:rPr>
         <w:t>Union County College, Scotch Plains, New Jersey</w:t>
       </w:r>
     </w:p>
     <w:p>
       <w:pPr>
-        <w:pStyle w:val="Heading1"/>
+        <w:tabs>
+          <w:tab w:pos="400" w:val="left"/>
+        </w:tabs>
+        <w:spacing w:before="0" w:after="44" w:line="276" w:lineRule="auto"/>
+        <w:ind w:left="400" w:hanging="200"/>
       </w:pPr>
       <w:r>
-        <w:t>Certifications and Class Work</w:t>
+        <w:rPr>
+          <w:rFonts w:ascii="Arial" w:hAnsi="Arial"/>
+          <w:color w:val="6B7280"/>
+          <w:sz w:val="17"/>
+        </w:rPr>
+        <w:t>•</w:t>
+        <w:tab/>
+      </w:r>
+      <w:r>
+        <w:rPr>
+          <w:rFonts w:ascii="Arial" w:hAnsi="Arial"/>
+          <w:color w:val="1F2937"/>
+          <w:sz w:val="17"/>
+        </w:rPr>
+        <w:t>Continued studies at Fairleigh Dickenson University, San Jose State University, Mission College, and Chico State</w:t>
       </w:r>
     </w:p>
     <w:p>
+      <w:pPr>
+        <w:keepNext/>
+        <w:spacing w:before="200" w:after="80"/>
+      </w:pPr>
       <w:r>
-        <w:t>• AWS Solutions Architect : Validation Number: 4Q2XDJDCK1EE1HC5</w:t>
-        <w:br/>
-        <w:t>• Docker Certified Associate (DCA)</w:t>
-        <w:br/>
-        <w:t>• Jenkins Quick Start &amp; Fundamentals</w:t>
+        <w:rPr>
+          <w:rFonts w:ascii="Arial" w:hAnsi="Arial"/>
+          <w:b/>
+          <w:color w:val="3B82F6"/>
+          <w:sz w:val="23"/>
+        </w:rPr>
+        <w:t>CERTIFICATIONS AND CLASS WORK</w:t>
+      </w:r>
+    </w:p>
+    <w:p>
+      <w:pPr>
+        <w:tabs>
+          <w:tab w:pos="400" w:val="left"/>
+        </w:tabs>
+        <w:spacing w:before="0" w:after="44" w:line="276" w:lineRule="auto"/>
+        <w:ind w:left="400" w:hanging="200"/>
+      </w:pPr>
+      <w:r>
+        <w:rPr>
+          <w:rFonts w:ascii="Arial" w:hAnsi="Arial"/>
+          <w:color w:val="6B7280"/>
+          <w:sz w:val="17"/>
+        </w:rPr>
+        <w:t>•</w:t>
+        <w:tab/>
+      </w:r>
+      <w:r>
+        <w:rPr>
+          <w:rFonts w:ascii="Arial" w:hAnsi="Arial"/>
+          <w:color w:val="3B82F6"/>
+          <w:sz w:val="17"/>
+        </w:rPr>
+        <w:t>AWS Solutions Architect</w:t>
+      </w:r>
+      <w:r>
+        <w:rPr>
+          <w:rFonts w:ascii="Arial" w:hAnsi="Arial"/>
+          <w:color w:val="1F2937"/>
+          <w:sz w:val="17"/>
+        </w:rPr>
+        <w:t>: Validation Number: 4Q2XDJDCK1EE1HC5</w:t>
+      </w:r>
+    </w:p>
+    <w:p>
+      <w:pPr>
+        <w:tabs>
+          <w:tab w:pos="400" w:val="left"/>
+        </w:tabs>
+        <w:spacing w:before="0" w:after="44" w:line="276" w:lineRule="auto"/>
+        <w:ind w:left="400" w:hanging="200"/>
+      </w:pPr>
+      <w:r>
+        <w:rPr>
+          <w:rFonts w:ascii="Arial" w:hAnsi="Arial"/>
+          <w:color w:val="6B7280"/>
+          <w:sz w:val="17"/>
+        </w:rPr>
+        <w:t>•</w:t>
+        <w:tab/>
+      </w:r>
+      <w:r>
+        <w:rPr>
+          <w:rFonts w:ascii="Arial" w:hAnsi="Arial"/>
+          <w:color w:val="3B82F6"/>
+          <w:sz w:val="17"/>
+        </w:rPr>
+        <w:t>Docker Certified Associate (DCA)</w:t>
+      </w:r>
+      <w:r>
+        <w:rPr>
+          <w:rFonts w:ascii="Arial" w:hAnsi="Arial"/>
+          <w:color w:val="1F2937"/>
+          <w:sz w:val="17"/>
+        </w:rPr>
+        <w:t>: Course Completed @ A Cloud Guru</w:t>
+      </w:r>
+    </w:p>
+    <w:p>
+      <w:pPr>
+        <w:tabs>
+          <w:tab w:pos="400" w:val="left"/>
+        </w:tabs>
+        <w:spacing w:before="0" w:after="44" w:line="276" w:lineRule="auto"/>
+        <w:ind w:left="400" w:hanging="200"/>
+      </w:pPr>
+      <w:r>
+        <w:rPr>
+          <w:rFonts w:ascii="Arial" w:hAnsi="Arial"/>
+          <w:color w:val="6B7280"/>
+          <w:sz w:val="17"/>
+        </w:rPr>
+        <w:t>•</w:t>
+        <w:tab/>
+      </w:r>
+      <w:r>
+        <w:rPr>
+          <w:rFonts w:ascii="Arial" w:hAnsi="Arial"/>
+          <w:color w:val="3B82F6"/>
+          <w:sz w:val="17"/>
+        </w:rPr>
+        <w:t>Jenkins Quick Start</w:t>
+      </w:r>
+      <w:r>
+        <w:rPr>
+          <w:rFonts w:ascii="Arial" w:hAnsi="Arial"/>
+          <w:color w:val="1F2937"/>
+          <w:sz w:val="17"/>
+        </w:rPr>
+        <w:t>: Course Completed @ A Cloud Guru</w:t>
+      </w:r>
+    </w:p>
+    <w:p>
+      <w:pPr>
+        <w:tabs>
+          <w:tab w:pos="400" w:val="left"/>
+        </w:tabs>
+        <w:spacing w:before="0" w:after="44" w:line="276" w:lineRule="auto"/>
+        <w:ind w:left="400" w:hanging="200"/>
+      </w:pPr>
+      <w:r>
+        <w:rPr>
+          <w:rFonts w:ascii="Arial" w:hAnsi="Arial"/>
+          <w:color w:val="6B7280"/>
+          <w:sz w:val="17"/>
+        </w:rPr>
+        <w:t>•</w:t>
+        <w:tab/>
+      </w:r>
+      <w:r>
+        <w:rPr>
+          <w:rFonts w:ascii="Arial" w:hAnsi="Arial"/>
+          <w:color w:val="3B82F6"/>
+          <w:sz w:val="17"/>
+        </w:rPr>
+        <w:t>Jenkins Fundamentals</w:t>
+      </w:r>
+      <w:r>
+        <w:rPr>
+          <w:rFonts w:ascii="Arial" w:hAnsi="Arial"/>
+          <w:color w:val="1F2937"/>
+          <w:sz w:val="17"/>
+        </w:rPr>
+        <w:t>: Course Completed @ A Cloud Guru</w:t>
       </w:r>
     </w:p>
     <w:sectPr>
       <w:pgSz w:w="12240" w:h="15840"/>
-      <w:pgMar w:top="1440" w:right="1800" w:bottom="1440" w:left="1800" w:header="720" w:footer="720" w:gutter="0"/>
+      <w:pgMar w:top="720" w:right="936" w:bottom="720" w:left="936" w:header="720" w:footer="720" w:gutter="0"/>
       <w:cols w:space="720"/>
       <w:docGrid w:linePitch="360"/>
     </w:sectPr>

</xml_diff>

<commit_message>
docs(resume): update Cohu to Remote and mark ClearMonitor as ongoing
</commit_message>
<xml_diff>
--- a/web/Resumes/Andrew/Resume.docx
+++ b/web/Resumes/Andrew/Resume.docx
@@ -717,7 +717,7 @@
           <w:color w:val="374151"/>
           <w:sz w:val="18"/>
         </w:rPr>
-        <w:t>ABS Consulting (Client: Cohu) | CA</w:t>
+        <w:t>ABS Consulting (Client: Cohu) | Remote</w:t>
       </w:r>
     </w:p>
     <w:p>
@@ -811,7 +811,7 @@
           <w:color w:val="DC2626"/>
           <w:sz w:val="19"/>
         </w:rPr>
-        <w:t>Senior Linux / SCM &amp; Perl Consultant | July 2026 - September 2026</w:t>
+        <w:t>Senior Linux / SCM &amp; Perl Consultant | July 2026 - Present</w:t>
       </w:r>
     </w:p>
     <w:p>

</xml_diff>